<commit_message>
docs: bitácora D-174, README y manual del simulador 1.2 (asas del hueso y agujero de la broca)
La entrada D-174 recoge por qué las asas giran sobre el centro del trozo y se
miden en el mundo, el arreglo del agujero de la broca y lo que se probó en
pantalla, con sus consecuencias malas. El manual pasa a la versión 1.2: asas en
«Mover → Un trozo», el agujero que ya no sobresale, dos filas en «Cuando algo no
sale» y tres en el anexo de gestos.

Co-Authored-By: Claude Sonnet 5.5 <noreply@anthropic.com>
</commit_message>
<xml_diff>
--- a/docs/MANUAL-DEL-SIMULADOR-QUIRURGICO.docx
+++ b/docs/MANUAL-DEL-SIMULADOR-QUIRURGICO.docx
@@ -153,7 +153,7 @@
           <w:sz w:val="20"/>
           <w:szCs w:val="20"/>
         </w:rPr>
-        <w:t xml:space="preserve">Versión 1.1 · 16 de octubre de 2026</w:t>
+        <w:t xml:space="preserve">Versión 1.2 · 16 de octubre de 2026</w:t>
       </w:r>
     </w:p>
     <w:p>
@@ -3043,7 +3043,17 @@
               <w:spacing w:after="30" w:line="264"/>
             </w:pPr>
             <w:r>
-              <w:t xml:space="preserve">Arrastrar coloca. «Todo junto» mueve piel, músculo y hueso a la vez; «Un trozo» agarra el trozo de hueso que se toque.</w:t>
+              <w:t xml:space="preserve">Arrastrar coloca. «Todo junto» mueve piel, músculo y hueso a la vez; «Un trozo» agarra el trozo de hueso que se toque y le pone sus </w:t>
+            </w:r>
+            <w:r>
+              <w:rPr>
+                <w:b/>
+                <w:bCs/>
+              </w:rPr>
+              <w:t xml:space="preserve">asas</w:t>
+            </w:r>
+            <w:r>
+              <w:t xml:space="preserve"> (flechas y aros) para moverlo y girarlo en cada eje.</w:t>
             </w:r>
           </w:p>
         </w:tc>
@@ -13379,6 +13389,24 @@
               <w:t xml:space="preserve"> en «Capas». Elija la broca AO de 3,2 mm, mantenga pulsado sobre la tibia y suelte: el registro dice «Perforación de Ø 3,2 mm y 19 mm, bicortical, 86° con el eje del hueso». Si la broca pasa de largo la cortical opuesta, lo dice.</w:t>
             </w:r>
           </w:p>
+          <w:p>
+            <w:pPr>
+              <w:spacing w:after="120" w:line="288"/>
+            </w:pPr>
+            <w:r>
+              <w:t xml:space="preserve">El agujero se dibuja solo </w:t>
+            </w:r>
+            <w:r>
+              <w:rPr>
+                <w:b/>
+                <w:bCs/>
+              </w:rPr>
+              <w:t xml:space="preserve">hasta la cortical opuesta</w:t>
+            </w:r>
+            <w:r>
+              <w:t xml:space="preserve">. Lo que la broca se pasó de largo no deja ningún cilindro suelto fuera del hueso, pero sigue contando: la consola lo avisa mientras ocurre y el paso lo puntúa como complicación si pasa de 3 mm.</w:t>
+            </w:r>
+          </w:p>
         </w:tc>
       </w:tr>
     </w:tbl>
@@ -14243,6 +14271,197 @@
         <w:t xml:space="preserve">.</w:t>
       </w:r>
     </w:p>
+    <w:p>
+      <w:pPr>
+        <w:spacing w:after="80" w:line="288"/>
+      </w:pPr>
+      <w:r>
+        <w:rPr>
+          <w:b/>
+          <w:bCs/>
+        </w:rPr>
+        <w:t xml:space="preserve">Las asas del trozo.</w:t>
+      </w:r>
+      <w:r>
+        <w:t xml:space="preserve"> Al agarrar un trozo con «Un trozo» aparecen sobre él las asas del taller anatómico. Con ellas se mueve y se gira el hueso </w:t>
+      </w:r>
+      <w:r>
+        <w:rPr>
+          <w:b/>
+          <w:bCs/>
+        </w:rPr>
+        <w:t xml:space="preserve">en cada eje</w:t>
+      </w:r>
+      <w:r>
+        <w:t xml:space="preserve">, que es lo que hace falta para corregir una angulación por todos los lados y hacer coincidir los fragmentos:</w:t>
+      </w:r>
+    </w:p>
+    <w:p>
+      <w:pPr>
+        <w:pStyle w:val="ListParagraph"/>
+        <w:numPr>
+          <w:ilvl w:val="0"/>
+          <w:numId w:val="4"/>
+        </w:numPr>
+        <w:spacing w:after="70" w:line="276"/>
+      </w:pPr>
+      <w:r>
+        <w:rPr>
+          <w:b/>
+          <w:bCs/>
+        </w:rPr>
+        <w:t xml:space="preserve">Las tres flechas</w:t>
+      </w:r>
+      <w:r>
+        <w:t xml:space="preserve"> (roja X, verde Y, azul Z) lo mueven a lo largo de ese eje: sirven para llevarlo hacia dentro o hacia fuera de la imagen, que con el ratón solo no se puede.</w:t>
+      </w:r>
+    </w:p>
+    <w:p>
+      <w:pPr>
+        <w:pStyle w:val="ListParagraph"/>
+        <w:numPr>
+          <w:ilvl w:val="0"/>
+          <w:numId w:val="4"/>
+        </w:numPr>
+        <w:spacing w:after="70" w:line="276"/>
+      </w:pPr>
+      <w:r>
+        <w:rPr>
+          <w:b/>
+          <w:bCs/>
+        </w:rPr>
+        <w:t xml:space="preserve">Los tres aros</w:t>
+      </w:r>
+      <w:r>
+        <w:t xml:space="preserve"> lo giran sobre ese eje, siempre sobre el centro del propio trozo: el hueso gira donde está, no describe un arco.</w:t>
+      </w:r>
+    </w:p>
+    <w:p>
+      <w:pPr>
+        <w:pStyle w:val="ListParagraph"/>
+        <w:numPr>
+          <w:ilvl w:val="0"/>
+          <w:numId w:val="4"/>
+        </w:numPr>
+        <w:spacing w:after="70" w:line="276"/>
+      </w:pPr>
+      <w:r>
+        <w:rPr>
+          <w:b/>
+          <w:bCs/>
+        </w:rPr>
+        <w:t xml:space="preserve">El aro blanco</w:t>
+      </w:r>
+      <w:r>
+        <w:t xml:space="preserve">, el más grande, lo gira sobre la línea de visión. Con </w:t>
+      </w:r>
+      <w:r>
+        <w:rPr>
+          <w:b/>
+          <w:bCs/>
+        </w:rPr>
+        <w:t xml:space="preserve">Ctrl</w:t>
+      </w:r>
+      <w:r>
+        <w:t xml:space="preserve"> pulsado el giro salta de cinco en cinco grados.</w:t>
+      </w:r>
+    </w:p>
+    <w:p>
+      <w:pPr>
+        <w:pStyle w:val="ListParagraph"/>
+        <w:numPr>
+          <w:ilvl w:val="0"/>
+          <w:numId w:val="4"/>
+        </w:numPr>
+        <w:spacing w:after="70" w:line="276"/>
+      </w:pPr>
+      <w:r>
+        <w:t xml:space="preserve">Arrastrar el hueso mismo sigue moviéndolo sobre la pantalla. Puede girar la vista (arrastrando en el vacío) sin perder la selección; un </w:t>
+      </w:r>
+      <w:r>
+        <w:rPr>
+          <w:b/>
+          <w:bCs/>
+        </w:rPr>
+        <w:t xml:space="preserve">clic en el vacío</w:t>
+      </w:r>
+      <w:r>
+        <w:t xml:space="preserve"> suelta el trozo y esconde las asas.</w:t>
+      </w:r>
+    </w:p>
+    <w:tbl>
+      <w:tblPr>
+        <w:tblW w:type="dxa" w:w="9360"/>
+        <w:tblBorders>
+          <w:top w:val="single" w:color="auto" w:sz="4"/>
+          <w:left w:val="single" w:color="auto" w:sz="4"/>
+          <w:bottom w:val="single" w:color="auto" w:sz="4"/>
+          <w:right w:val="single" w:color="auto" w:sz="4"/>
+          <w:insideH w:val="single" w:color="auto" w:sz="4"/>
+          <w:insideV w:val="single" w:color="auto" w:sz="4"/>
+        </w:tblBorders>
+      </w:tblPr>
+      <w:tblGrid>
+        <w:gridCol w:w="9360"/>
+      </w:tblGrid>
+      <w:tr>
+        <w:trPr>
+          <w:cantSplit/>
+        </w:trPr>
+        <w:tc>
+          <w:tcPr>
+            <w:tcW w:type="dxa" w:w="9360"/>
+            <w:tcBorders>
+              <w:top w:val="single" w:color="EEF3FB" w:sz="1"/>
+              <w:left w:val="single" w:color="1F5FBF" w:sz="24"/>
+              <w:bottom w:val="single" w:color="EEF3FB" w:sz="1"/>
+              <w:right w:val="single" w:color="EEF3FB" w:sz="1"/>
+            </w:tcBorders>
+            <w:shd w:fill="EEF3FB" w:color="auto" w:val="clear"/>
+            <w:tcMar>
+              <w:top w:type="dxa" w:w="100"/>
+              <w:left w:type="dxa" w:w="180"/>
+              <w:bottom w:type="dxa" w:w="80"/>
+              <w:right w:type="dxa" w:w="180"/>
+            </w:tcMar>
+          </w:tcPr>
+          <w:p>
+            <w:pPr>
+              <w:spacing w:after="60"/>
+            </w:pPr>
+            <w:r>
+              <w:rPr>
+                <w:b/>
+                <w:bCs/>
+                <w:color w:val="1F5FBF"/>
+              </w:rPr>
+              <w:t xml:space="preserve">Las asas y los deslizadores</w:t>
+            </w:r>
+          </w:p>
+          <w:p>
+            <w:pPr>
+              <w:spacing w:after="60" w:line="276"/>
+            </w:pPr>
+            <w:r>
+              <w:t xml:space="preserve">Los ejes de las asas son los del modelo, no los del hueso. En el paso de reducir, los deslizadores «Varo / valgo», «Ante / recurvatum» y «Rotación» afinan la angulación; los dos caminos se actualizan entre sí al soltar el ratón, y el panel de medidas (desplazamiento, angulación, diástasis) siempre dice dónde quedó.</w:t>
+            </w:r>
+          </w:p>
+          <w:p>
+            <w:pPr>
+              <w:spacing w:after="60" w:line="276"/>
+            </w:pPr>
+            <w:r>
+              <w:t xml:space="preserve">Las asas valen para cualquier trozo de hueso, no solo para el fragmento que el caso mide; solo ese cambia las medidas. «Volver al desplazamiento inicial» devuelve todos a su sitio.</w:t>
+            </w:r>
+          </w:p>
+        </w:tc>
+      </w:tr>
+    </w:tbl>
+    <w:p>
+      <w:pPr>
+        <w:spacing w:after="60"/>
+      </w:pPr>
+    </w:p>
     <w:tbl>
       <w:tblPr>
         <w:tblW w:type="dxa" w:w="9360"/>
@@ -19131,6 +19350,118 @@
               <w:spacing w:after="30" w:line="264"/>
             </w:pPr>
             <w:r>
+              <w:t xml:space="preserve">No aparecen las asas al agarrar el hueso</w:t>
+            </w:r>
+          </w:p>
+        </w:tc>
+        <w:tc>
+          <w:tcPr>
+            <w:tcW w:type="dxa" w:w="6260"/>
+            <w:tcBorders>
+              <w:top w:val="single" w:color="C9D3E3" w:sz="4"/>
+              <w:left w:val="single" w:color="C9D3E3" w:sz="4"/>
+              <w:bottom w:val="single" w:color="C9D3E3" w:sz="4"/>
+              <w:right w:val="single" w:color="C9D3E3" w:sz="4"/>
+            </w:tcBorders>
+            <w:tcMar>
+              <w:top w:type="dxa" w:w="70"/>
+              <w:left w:type="dxa" w:w="110"/>
+              <w:bottom w:type="dxa" w:w="70"/>
+              <w:right w:type="dxa" w:w="110"/>
+            </w:tcMar>
+          </w:tcPr>
+          <w:p>
+            <w:pPr>
+              <w:spacing w:after="30" w:line="264"/>
+            </w:pPr>
+            <w:r>
+              <w:t xml:space="preserve">Solo salen en «Mover» con el submodo «Un trozo» y con la capa «Hueso» encendida; con «Todo junto» el arrastre mueve el modelo entero. Un clic en el vacío las suelta: vuelva a pulsar el hueso.</w:t>
+            </w:r>
+          </w:p>
+        </w:tc>
+      </w:tr>
+      <w:tr>
+        <w:trPr>
+          <w:cantSplit/>
+        </w:trPr>
+        <w:tc>
+          <w:tcPr>
+            <w:tcW w:type="dxa" w:w="3100"/>
+            <w:tcBorders>
+              <w:top w:val="single" w:color="C9D3E3" w:sz="4"/>
+              <w:left w:val="single" w:color="C9D3E3" w:sz="4"/>
+              <w:bottom w:val="single" w:color="C9D3E3" w:sz="4"/>
+              <w:right w:val="single" w:color="C9D3E3" w:sz="4"/>
+            </w:tcBorders>
+            <w:shd w:fill="F6F8FC" w:color="auto" w:val="clear"/>
+            <w:tcMar>
+              <w:top w:type="dxa" w:w="70"/>
+              <w:left w:type="dxa" w:w="110"/>
+              <w:bottom w:type="dxa" w:w="70"/>
+              <w:right w:type="dxa" w:w="110"/>
+            </w:tcMar>
+          </w:tcPr>
+          <w:p>
+            <w:pPr>
+              <w:spacing w:after="30" w:line="264"/>
+            </w:pPr>
+            <w:r>
+              <w:t xml:space="preserve">Agarro una flecha y gira el hueso (o al revés)</w:t>
+            </w:r>
+          </w:p>
+        </w:tc>
+        <w:tc>
+          <w:tcPr>
+            <w:tcW w:type="dxa" w:w="6260"/>
+            <w:tcBorders>
+              <w:top w:val="single" w:color="C9D3E3" w:sz="4"/>
+              <w:left w:val="single" w:color="C9D3E3" w:sz="4"/>
+              <w:bottom w:val="single" w:color="C9D3E3" w:sz="4"/>
+              <w:right w:val="single" w:color="C9D3E3" w:sz="4"/>
+            </w:tcBorders>
+            <w:shd w:fill="F6F8FC" w:color="auto" w:val="clear"/>
+            <w:tcMar>
+              <w:top w:type="dxa" w:w="70"/>
+              <w:left w:type="dxa" w:w="110"/>
+              <w:bottom w:type="dxa" w:w="70"/>
+              <w:right w:type="dxa" w:w="110"/>
+            </w:tcMar>
+          </w:tcPr>
+          <w:p>
+            <w:pPr>
+              <w:spacing w:after="30" w:line="264"/>
+            </w:pPr>
+            <w:r>
+              <w:t xml:space="preserve">Donde una flecha cruza un aro se pueden confundir. Acerque el modelo con Ctrl + rueda para separarlos, o agarre la flecha por la punta, que queda fuera de los aros.</w:t>
+            </w:r>
+          </w:p>
+        </w:tc>
+      </w:tr>
+      <w:tr>
+        <w:trPr>
+          <w:cantSplit/>
+        </w:trPr>
+        <w:tc>
+          <w:tcPr>
+            <w:tcW w:type="dxa" w:w="3100"/>
+            <w:tcBorders>
+              <w:top w:val="single" w:color="C9D3E3" w:sz="4"/>
+              <w:left w:val="single" w:color="C9D3E3" w:sz="4"/>
+              <w:bottom w:val="single" w:color="C9D3E3" w:sz="4"/>
+              <w:right w:val="single" w:color="C9D3E3" w:sz="4"/>
+            </w:tcBorders>
+            <w:tcMar>
+              <w:top w:type="dxa" w:w="70"/>
+              <w:left w:type="dxa" w:w="110"/>
+              <w:bottom w:type="dxa" w:w="70"/>
+              <w:right w:type="dxa" w:w="110"/>
+            </w:tcMar>
+          </w:tcPr>
+          <w:p>
+            <w:pPr>
+              <w:spacing w:after="30" w:line="264"/>
+            </w:pPr>
+            <w:r>
               <w:t xml:space="preserve">El recuadro de la fluoroscopia tapa el modelo</w:t>
             </w:r>
           </w:p>
@@ -21104,6 +21435,174 @@
               <w:spacing w:after="30" w:line="264"/>
             </w:pPr>
             <w:r>
+              <w:t xml:space="preserve">Arrastrar una flecha (Mover → Un trozo)</w:t>
+            </w:r>
+          </w:p>
+        </w:tc>
+        <w:tc>
+          <w:tcPr>
+            <w:tcW w:type="dxa" w:w="6060"/>
+            <w:tcBorders>
+              <w:top w:val="single" w:color="C9D3E3" w:sz="4"/>
+              <w:left w:val="single" w:color="C9D3E3" w:sz="4"/>
+              <w:bottom w:val="single" w:color="C9D3E3" w:sz="4"/>
+              <w:right w:val="single" w:color="C9D3E3" w:sz="4"/>
+            </w:tcBorders>
+            <w:shd w:fill="F6F8FC" w:color="auto" w:val="clear"/>
+            <w:tcMar>
+              <w:top w:type="dxa" w:w="70"/>
+              <w:left w:type="dxa" w:w="110"/>
+              <w:bottom w:type="dxa" w:w="70"/>
+              <w:right w:type="dxa" w:w="110"/>
+            </w:tcMar>
+          </w:tcPr>
+          <w:p>
+            <w:pPr>
+              <w:spacing w:after="30" w:line="264"/>
+            </w:pPr>
+            <w:r>
+              <w:t xml:space="preserve">Mueve el trozo elegido a lo largo de ese eje.</w:t>
+            </w:r>
+          </w:p>
+        </w:tc>
+      </w:tr>
+      <w:tr>
+        <w:trPr>
+          <w:cantSplit/>
+        </w:trPr>
+        <w:tc>
+          <w:tcPr>
+            <w:tcW w:type="dxa" w:w="3300"/>
+            <w:tcBorders>
+              <w:top w:val="single" w:color="C9D3E3" w:sz="4"/>
+              <w:left w:val="single" w:color="C9D3E3" w:sz="4"/>
+              <w:bottom w:val="single" w:color="C9D3E3" w:sz="4"/>
+              <w:right w:val="single" w:color="C9D3E3" w:sz="4"/>
+            </w:tcBorders>
+            <w:tcMar>
+              <w:top w:type="dxa" w:w="70"/>
+              <w:left w:type="dxa" w:w="110"/>
+              <w:bottom w:type="dxa" w:w="70"/>
+              <w:right w:type="dxa" w:w="110"/>
+            </w:tcMar>
+          </w:tcPr>
+          <w:p>
+            <w:pPr>
+              <w:spacing w:after="30" w:line="264"/>
+            </w:pPr>
+            <w:r>
+              <w:t xml:space="preserve">Arrastrar un aro (Mover → Un trozo)</w:t>
+            </w:r>
+          </w:p>
+        </w:tc>
+        <w:tc>
+          <w:tcPr>
+            <w:tcW w:type="dxa" w:w="6060"/>
+            <w:tcBorders>
+              <w:top w:val="single" w:color="C9D3E3" w:sz="4"/>
+              <w:left w:val="single" w:color="C9D3E3" w:sz="4"/>
+              <w:bottom w:val="single" w:color="C9D3E3" w:sz="4"/>
+              <w:right w:val="single" w:color="C9D3E3" w:sz="4"/>
+            </w:tcBorders>
+            <w:tcMar>
+              <w:top w:type="dxa" w:w="70"/>
+              <w:left w:type="dxa" w:w="110"/>
+              <w:bottom w:type="dxa" w:w="70"/>
+              <w:right w:type="dxa" w:w="110"/>
+            </w:tcMar>
+          </w:tcPr>
+          <w:p>
+            <w:pPr>
+              <w:spacing w:after="30" w:line="264"/>
+            </w:pPr>
+            <w:r>
+              <w:t xml:space="preserve">Gira el trozo sobre ese eje; con Ctrl, de cinco en cinco grados. El aro blanco gira sobre la línea de visión.</w:t>
+            </w:r>
+          </w:p>
+        </w:tc>
+      </w:tr>
+      <w:tr>
+        <w:trPr>
+          <w:cantSplit/>
+        </w:trPr>
+        <w:tc>
+          <w:tcPr>
+            <w:tcW w:type="dxa" w:w="3300"/>
+            <w:tcBorders>
+              <w:top w:val="single" w:color="C9D3E3" w:sz="4"/>
+              <w:left w:val="single" w:color="C9D3E3" w:sz="4"/>
+              <w:bottom w:val="single" w:color="C9D3E3" w:sz="4"/>
+              <w:right w:val="single" w:color="C9D3E3" w:sz="4"/>
+            </w:tcBorders>
+            <w:shd w:fill="F6F8FC" w:color="auto" w:val="clear"/>
+            <w:tcMar>
+              <w:top w:type="dxa" w:w="70"/>
+              <w:left w:type="dxa" w:w="110"/>
+              <w:bottom w:type="dxa" w:w="70"/>
+              <w:right w:type="dxa" w:w="110"/>
+            </w:tcMar>
+          </w:tcPr>
+          <w:p>
+            <w:pPr>
+              <w:spacing w:after="30" w:line="264"/>
+            </w:pPr>
+            <w:r>
+              <w:t xml:space="preserve">Clic en el vacío (Mover → Un trozo)</w:t>
+            </w:r>
+          </w:p>
+        </w:tc>
+        <w:tc>
+          <w:tcPr>
+            <w:tcW w:type="dxa" w:w="6060"/>
+            <w:tcBorders>
+              <w:top w:val="single" w:color="C9D3E3" w:sz="4"/>
+              <w:left w:val="single" w:color="C9D3E3" w:sz="4"/>
+              <w:bottom w:val="single" w:color="C9D3E3" w:sz="4"/>
+              <w:right w:val="single" w:color="C9D3E3" w:sz="4"/>
+            </w:tcBorders>
+            <w:shd w:fill="F6F8FC" w:color="auto" w:val="clear"/>
+            <w:tcMar>
+              <w:top w:type="dxa" w:w="70"/>
+              <w:left w:type="dxa" w:w="110"/>
+              <w:bottom w:type="dxa" w:w="70"/>
+              <w:right w:type="dxa" w:w="110"/>
+            </w:tcMar>
+          </w:tcPr>
+          <w:p>
+            <w:pPr>
+              <w:spacing w:after="30" w:line="264"/>
+            </w:pPr>
+            <w:r>
+              <w:t xml:space="preserve">Suelta el trozo elegido y esconde sus asas.</w:t>
+            </w:r>
+          </w:p>
+        </w:tc>
+      </w:tr>
+      <w:tr>
+        <w:trPr>
+          <w:cantSplit/>
+        </w:trPr>
+        <w:tc>
+          <w:tcPr>
+            <w:tcW w:type="dxa" w:w="3300"/>
+            <w:tcBorders>
+              <w:top w:val="single" w:color="C9D3E3" w:sz="4"/>
+              <w:left w:val="single" w:color="C9D3E3" w:sz="4"/>
+              <w:bottom w:val="single" w:color="C9D3E3" w:sz="4"/>
+              <w:right w:val="single" w:color="C9D3E3" w:sz="4"/>
+            </w:tcBorders>
+            <w:tcMar>
+              <w:top w:type="dxa" w:w="70"/>
+              <w:left w:type="dxa" w:w="110"/>
+              <w:bottom w:type="dxa" w:w="70"/>
+              <w:right w:type="dxa" w:w="110"/>
+            </w:tcMar>
+          </w:tcPr>
+          <w:p>
+            <w:pPr>
+              <w:spacing w:after="30" w:line="264"/>
+            </w:pPr>
+            <w:r>
               <w:t xml:space="preserve">Dos clics (modo Trazar, línea recta)</w:t>
             </w:r>
           </w:p>
@@ -21117,7 +21616,6 @@
               <w:bottom w:val="single" w:color="C9D3E3" w:sz="4"/>
               <w:right w:val="single" w:color="C9D3E3" w:sz="4"/>
             </w:tcBorders>
-            <w:shd w:fill="F6F8FC" w:color="auto" w:val="clear"/>
             <w:tcMar>
               <w:top w:type="dxa" w:w="70"/>
               <w:left w:type="dxa" w:w="110"/>
@@ -21161,6 +21659,7 @@
               <w:bottom w:val="single" w:color="C9D3E3" w:sz="4"/>
               <w:right w:val="single" w:color="C9D3E3" w:sz="4"/>
             </w:tcBorders>
+            <w:shd w:fill="F6F8FC" w:color="auto" w:val="clear"/>
             <w:tcMar>
               <w:top w:type="dxa" w:w="70"/>
               <w:left w:type="dxa" w:w="110"/>
@@ -21186,6 +21685,7 @@
               <w:bottom w:val="single" w:color="C9D3E3" w:sz="4"/>
               <w:right w:val="single" w:color="C9D3E3" w:sz="4"/>
             </w:tcBorders>
+            <w:shd w:fill="F6F8FC" w:color="auto" w:val="clear"/>
             <w:tcMar>
               <w:top w:type="dxa" w:w="70"/>
               <w:left w:type="dxa" w:w="110"/>
@@ -21216,7 +21716,6 @@
               <w:bottom w:val="single" w:color="C9D3E3" w:sz="4"/>
               <w:right w:val="single" w:color="C9D3E3" w:sz="4"/>
             </w:tcBorders>
-            <w:shd w:fill="F6F8FC" w:color="auto" w:val="clear"/>
             <w:tcMar>
               <w:top w:type="dxa" w:w="70"/>
               <w:left w:type="dxa" w:w="110"/>
@@ -21242,7 +21741,6 @@
               <w:bottom w:val="single" w:color="C9D3E3" w:sz="4"/>
               <w:right w:val="single" w:color="C9D3E3" w:sz="4"/>
             </w:tcBorders>
-            <w:shd w:fill="F6F8FC" w:color="auto" w:val="clear"/>
             <w:tcMar>
               <w:top w:type="dxa" w:w="70"/>
               <w:left w:type="dxa" w:w="110"/>
@@ -21273,6 +21771,7 @@
               <w:bottom w:val="single" w:color="C9D3E3" w:sz="4"/>
               <w:right w:val="single" w:color="C9D3E3" w:sz="4"/>
             </w:tcBorders>
+            <w:shd w:fill="F6F8FC" w:color="auto" w:val="clear"/>
             <w:tcMar>
               <w:top w:type="dxa" w:w="70"/>
               <w:left w:type="dxa" w:w="110"/>
@@ -21298,6 +21797,7 @@
               <w:bottom w:val="single" w:color="C9D3E3" w:sz="4"/>
               <w:right w:val="single" w:color="C9D3E3" w:sz="4"/>
             </w:tcBorders>
+            <w:shd w:fill="F6F8FC" w:color="auto" w:val="clear"/>
             <w:tcMar>
               <w:top w:type="dxa" w:w="70"/>
               <w:left w:type="dxa" w:w="110"/>
@@ -21328,7 +21828,6 @@
               <w:bottom w:val="single" w:color="C9D3E3" w:sz="4"/>
               <w:right w:val="single" w:color="C9D3E3" w:sz="4"/>
             </w:tcBorders>
-            <w:shd w:fill="F6F8FC" w:color="auto" w:val="clear"/>
             <w:tcMar>
               <w:top w:type="dxa" w:w="70"/>
               <w:left w:type="dxa" w:w="110"/>
@@ -21364,7 +21863,6 @@
               <w:bottom w:val="single" w:color="C9D3E3" w:sz="4"/>
               <w:right w:val="single" w:color="C9D3E3" w:sz="4"/>
             </w:tcBorders>
-            <w:shd w:fill="F6F8FC" w:color="auto" w:val="clear"/>
             <w:tcMar>
               <w:top w:type="dxa" w:w="70"/>
               <w:left w:type="dxa" w:w="110"/>
@@ -21395,6 +21893,7 @@
               <w:bottom w:val="single" w:color="C9D3E3" w:sz="4"/>
               <w:right w:val="single" w:color="C9D3E3" w:sz="4"/>
             </w:tcBorders>
+            <w:shd w:fill="F6F8FC" w:color="auto" w:val="clear"/>
             <w:tcMar>
               <w:top w:type="dxa" w:w="70"/>
               <w:left w:type="dxa" w:w="110"/>
@@ -21430,6 +21929,7 @@
               <w:bottom w:val="single" w:color="C9D3E3" w:sz="4"/>
               <w:right w:val="single" w:color="C9D3E3" w:sz="4"/>
             </w:tcBorders>
+            <w:shd w:fill="F6F8FC" w:color="auto" w:val="clear"/>
             <w:tcMar>
               <w:top w:type="dxa" w:w="70"/>
               <w:left w:type="dxa" w:w="110"/>
@@ -21747,7 +22247,7 @@
         <w:sz w:val="17"/>
         <w:szCs w:val="17"/>
       </w:rPr>
-      <w:t xml:space="preserve">Versión 1.1 · octubre de 2026</w:t>
+      <w:t xml:space="preserve">Versión 1.2 · octubre de 2026</w:t>
     </w:r>
     <w:r>
       <w:rPr>

</xml_diff>

<commit_message>
docs: manuales de Word al 21 de octubre (simulador 1.4 y taller 1.1) con el logotipo de TraumaHub y el capítulo de novedades de P-004
Co-Authored-By: Claude Sonnet 5.5 <noreply@anthropic.com>
</commit_message>
<xml_diff>
--- a/docs/MANUAL-DEL-SIMULADOR-QUIRURGICO.docx
+++ b/docs/MANUAL-DEL-SIMULADOR-QUIRURGICO.docx
@@ -4,19 +4,48 @@
   <w:body>
     <w:p>
       <w:pPr>
-        <w:spacing w:after="40" w:before="1700"/>
+        <w:spacing w:after="60" w:before="700"/>
         <w:jc w:val="center"/>
       </w:pPr>
       <w:r>
-        <w:rPr>
-          <w:b/>
-          <w:bCs/>
-          <w:color w:val="1F5FBF"/>
-          <w:spacing w:val="60"/>
-          <w:sz w:val="30"/>
-          <w:szCs w:val="30"/>
-        </w:rPr>
-        <w:t xml:space="preserve">TraumaHub</w:t>
+        <w:drawing>
+          <wp:inline distT="0" distB="0" distL="0" distR="0">
+            <wp:extent cx="2651760" cy="1587496"/>
+            <wp:effectExtent t="0" r="0" b="0" l="0"/>
+            <wp:docPr id="9900" name="logo-traumahub" descr="Logotipo de TraumaHub" title="Logotipo de TraumaHub"/>
+            <wp:cNvGraphicFramePr>
+              <a:graphicFrameLocks xmlns:a="http://schemas.openxmlformats.org/drawingml/2006/main" noChangeAspect="1"/>
+            </wp:cNvGraphicFramePr>
+            <a:graphic xmlns:a="http://schemas.openxmlformats.org/drawingml/2006/main">
+              <a:graphicData uri="http://schemas.openxmlformats.org/drawingml/2006/picture">
+                <pic:pic xmlns:pic="http://schemas.openxmlformats.org/drawingml/2006/picture">
+                  <pic:nvPicPr>
+                    <pic:cNvPr id="0" name="" descr=""/>
+                    <pic:cNvPicPr>
+                      <a:picLocks noChangeAspect="1" noChangeArrowheads="1"/>
+                    </pic:cNvPicPr>
+                  </pic:nvPicPr>
+                  <pic:blipFill>
+                    <a:blip r:embed="rId9901" cstate="none"/>
+                    <a:srcRect/>
+                    <a:stretch>
+                      <a:fillRect/>
+                    </a:stretch>
+                  </pic:blipFill>
+                  <pic:spPr bwMode="auto">
+                    <a:xfrm>
+                      <a:off x="0" y="0"/>
+                      <a:ext cx="2651760" cy="1587496"/>
+                    </a:xfrm>
+                    <a:prstGeom prst="rect">
+                      <a:avLst/>
+                    </a:prstGeom>
+                  </pic:spPr>
+                </pic:pic>
+              </a:graphicData>
+            </a:graphic>
+          </wp:inline>
+        </w:drawing>
       </w:r>
     </w:p>
     <w:p>
@@ -153,7 +182,7 @@
           <w:sz w:val="20"/>
           <w:szCs w:val="20"/>
         </w:rPr>
-        <w:t xml:space="preserve">Versión 1.3 · 16 de octubre de 2026</w:t>
+        <w:t xml:space="preserve">Versión 1.4 · 21 de octubre de 2026</w:t>
       </w:r>
     </w:p>
     <w:p>
@@ -808,6 +837,19 @@
               <w:right w:type="dxa" w:w="60"/>
             </w:tcMar>
           </w:tcPr>
+          <w:p>
+            <w:pPr>
+              <w:spacing w:after="20"/>
+            </w:pPr>
+            <w:hyperlink w:history="1" w:anchor="cap13">
+              <w:r>
+                <w:rPr>
+                  <w:rStyle w:val="Hyperlink"/>
+                </w:rPr>
+                <w:t xml:space="preserve">13. Novedades de la versión 1.4</w:t>
+              </w:r>
+            </w:hyperlink>
+          </w:p>
           <w:p>
             <w:pPr>
               <w:spacing w:after="20"/>
@@ -19964,6 +20006,1529 @@
         <w:pStyle w:val="Heading1"/>
         <w:pageBreakBefore/>
       </w:pPr>
+      <w:bookmarkStart w:name="cap13" w:id="90"/>
+      <w:r>
+        <w:t xml:space="preserve">13. Novedades de la versión 1.4</w:t>
+      </w:r>
+      <w:bookmarkEnd w:id="90"/>
+    </w:p>
+    <w:p>
+      <w:pPr>
+        <w:spacing w:after="120" w:line="288"/>
+      </w:pPr>
+      <w:r>
+        <w:t xml:space="preserve">Este capítulo reúne lo que cambió en el simulador desde la versión 1.3 (16 de octubre de 2026). Es lo que ya funciona en la plataforma; donde un capítulo anterior diga otra cosa, </w:t>
+      </w:r>
+      <w:r>
+        <w:rPr>
+          <w:b/>
+          <w:bCs/>
+        </w:rPr>
+        <w:t xml:space="preserve">vale lo de aquí</w:t>
+      </w:r>
+      <w:r>
+        <w:t xml:space="preserve">. Lo marcado como «para el editor» es lo que cambia en la forma de escribir un caso.</w:t>
+      </w:r>
+    </w:p>
+    <w:p>
+      <w:pPr>
+        <w:pStyle w:val="Heading2"/>
+      </w:pPr>
+      <w:r>
+        <w:t xml:space="preserve">13.1 En un vistazo</w:t>
+      </w:r>
+    </w:p>
+    <w:p>
+      <w:pPr>
+        <w:pStyle w:val="ListParagraph"/>
+        <w:numPr>
+          <w:ilvl w:val="0"/>
+          <w:numId w:val="4"/>
+        </w:numPr>
+        <w:spacing w:after="90" w:line="280"/>
+      </w:pPr>
+      <w:r>
+        <w:rPr>
+          <w:b/>
+          <w:bCs/>
+        </w:rPr>
+        <w:t xml:space="preserve">Modelos 3D en dos carpetas:</w:t>
+      </w:r>
+      <w:r>
+        <w:t xml:space="preserve"> «Herramientas» y «Modelos del cuerpo».</w:t>
+      </w:r>
+    </w:p>
+    <w:p>
+      <w:pPr>
+        <w:pStyle w:val="ListParagraph"/>
+        <w:numPr>
+          <w:ilvl w:val="0"/>
+          <w:numId w:val="4"/>
+        </w:numPr>
+        <w:spacing w:after="90" w:line="280"/>
+      </w:pPr>
+      <w:r>
+        <w:rPr>
+          <w:b/>
+          <w:bCs/>
+        </w:rPr>
+        <w:t xml:space="preserve">La bandeja trae toda la mesa</w:t>
+      </w:r>
+      <w:r>
+        <w:t xml:space="preserve"> por omisión; los insumos de cada recorrido quedan guardados.</w:t>
+      </w:r>
+    </w:p>
+    <w:p>
+      <w:pPr>
+        <w:pStyle w:val="ListParagraph"/>
+        <w:numPr>
+          <w:ilvl w:val="0"/>
+          <w:numId w:val="4"/>
+        </w:numPr>
+        <w:spacing w:after="90" w:line="280"/>
+      </w:pPr>
+      <w:r>
+        <w:rPr>
+          <w:b/>
+          <w:bCs/>
+        </w:rPr>
+        <w:t xml:space="preserve">Los modos de ratón, en una barra sobre el lienzo</w:t>
+      </w:r>
+      <w:r>
+        <w:t xml:space="preserve">, de izquierda a derecha; «Info» pasa a llamarse </w:t>
+      </w:r>
+      <w:r>
+        <w:rPr>
+          <w:b/>
+          <w:bCs/>
+        </w:rPr>
+        <w:t xml:space="preserve">«Seleccionar estructura»</w:t>
+      </w:r>
+      <w:r>
+        <w:t xml:space="preserve">.</w:t>
+      </w:r>
+    </w:p>
+    <w:p>
+      <w:pPr>
+        <w:pStyle w:val="ListParagraph"/>
+        <w:numPr>
+          <w:ilvl w:val="0"/>
+          <w:numId w:val="4"/>
+        </w:numPr>
+        <w:spacing w:after="90" w:line="280"/>
+      </w:pPr>
+      <w:r>
+        <w:rPr>
+          <w:b/>
+          <w:bCs/>
+        </w:rPr>
+        <w:t xml:space="preserve">Separar con un clic:</w:t>
+      </w:r>
+      <w:r>
+        <w:t xml:space="preserve"> el clic decide el plano y un músculo se aparta con un solo clic.</w:t>
+      </w:r>
+    </w:p>
+    <w:p>
+      <w:pPr>
+        <w:pStyle w:val="ListParagraph"/>
+        <w:numPr>
+          <w:ilvl w:val="0"/>
+          <w:numId w:val="4"/>
+        </w:numPr>
+        <w:spacing w:after="90" w:line="280"/>
+      </w:pPr>
+      <w:r>
+        <w:rPr>
+          <w:b/>
+          <w:bCs/>
+        </w:rPr>
+        <w:t xml:space="preserve">Una sola placa</w:t>
+      </w:r>
+      <w:r>
+        <w:t xml:space="preserve">, con direcciones del paciente y orificios que declara el editor; </w:t>
+      </w:r>
+      <w:r>
+        <w:rPr>
+          <w:b/>
+          <w:bCs/>
+        </w:rPr>
+        <w:t xml:space="preserve">tornillos por tipo</w:t>
+      </w:r>
+      <w:r>
+        <w:t xml:space="preserve">, secuencia que se despliega sola y trayectoria de dos clics.</w:t>
+      </w:r>
+    </w:p>
+    <w:p>
+      <w:pPr>
+        <w:pStyle w:val="ListParagraph"/>
+        <w:numPr>
+          <w:ilvl w:val="0"/>
+          <w:numId w:val="4"/>
+        </w:numPr>
+        <w:spacing w:after="90" w:line="280"/>
+      </w:pPr>
+      <w:r>
+        <w:rPr>
+          <w:b/>
+          <w:bCs/>
+        </w:rPr>
+        <w:t xml:space="preserve">Menú «Mover» por ejes</w:t>
+      </w:r>
+      <w:r>
+        <w:t xml:space="preserve"> para el trozo y la placa, y </w:t>
+      </w:r>
+      <w:r>
+        <w:rPr>
+          <w:b/>
+          <w:bCs/>
+        </w:rPr>
+        <w:t xml:space="preserve">reducción automática</w:t>
+      </w:r>
+      <w:r>
+        <w:t xml:space="preserve"> que no puntúa.</w:t>
+      </w:r>
+    </w:p>
+    <w:p>
+      <w:pPr>
+        <w:pStyle w:val="ListParagraph"/>
+        <w:numPr>
+          <w:ilvl w:val="0"/>
+          <w:numId w:val="4"/>
+        </w:numPr>
+        <w:spacing w:after="90" w:line="280"/>
+      </w:pPr>
+      <w:r>
+        <w:rPr>
+          <w:b/>
+          <w:bCs/>
+        </w:rPr>
+        <w:t xml:space="preserve">La broca y el medidor se quedan puestos</w:t>
+      </w:r>
+      <w:r>
+        <w:t xml:space="preserve"> en el orificio mientras se pide el disparo.</w:t>
+      </w:r>
+    </w:p>
+    <w:p>
+      <w:pPr>
+        <w:pStyle w:val="ListParagraph"/>
+        <w:numPr>
+          <w:ilvl w:val="0"/>
+          <w:numId w:val="4"/>
+        </w:numPr>
+        <w:spacing w:after="90" w:line="280"/>
+      </w:pPr>
+      <w:r>
+        <w:rPr>
+          <w:b/>
+          <w:bCs/>
+        </w:rPr>
+        <w:t xml:space="preserve">Compresión de la fractura:</w:t>
+      </w:r>
+      <w:r>
+        <w:t xml:space="preserve"> orificio oval con tornillo excéntrico, broca de deslizamiento y rosca parcial; objetivo opcional de paso.</w:t>
+      </w:r>
+    </w:p>
+    <w:p>
+      <w:pPr>
+        <w:pStyle w:val="ListParagraph"/>
+        <w:numPr>
+          <w:ilvl w:val="0"/>
+          <w:numId w:val="4"/>
+        </w:numPr>
+        <w:spacing w:after="90" w:line="280"/>
+      </w:pPr>
+      <w:r>
+        <w:rPr>
+          <w:b/>
+          <w:bCs/>
+        </w:rPr>
+        <w:t xml:space="preserve">Radiografía postoperatoria</w:t>
+      </w:r>
+      <w:r>
+        <w:t xml:space="preserve"> al terminar la cirugía, con su lámina en PNG para presentar.</w:t>
+      </w:r>
+    </w:p>
+    <w:p>
+      <w:pPr>
+        <w:pStyle w:val="Heading2"/>
+      </w:pPr>
+      <w:r>
+        <w:t xml:space="preserve">13.2 Modelos 3D en dos carpetas y bandeja completa</w:t>
+      </w:r>
+    </w:p>
+    <w:p>
+      <w:pPr>
+        <w:spacing w:after="120" w:line="288"/>
+      </w:pPr>
+      <w:r>
+        <w:t xml:space="preserve">En «Contenido» → «Modelos 3D» hay </w:t>
+      </w:r>
+      <w:r>
+        <w:rPr>
+          <w:b/>
+          <w:bCs/>
+        </w:rPr>
+        <w:t xml:space="preserve">dos pestañas</w:t>
+      </w:r>
+      <w:r>
+        <w:t xml:space="preserve">: </w:t>
+      </w:r>
+      <w:r>
+        <w:rPr>
+          <w:b/>
+          <w:bCs/>
+        </w:rPr>
+        <w:t xml:space="preserve">«Herramientas»</w:t>
+      </w:r>
+      <w:r>
+        <w:t xml:space="preserve"> (lo que el residente tiene en la mano: instrumentos, placas, tornillos) y </w:t>
+      </w:r>
+      <w:r>
+        <w:rPr>
+          <w:b/>
+          <w:bCs/>
+        </w:rPr>
+        <w:t xml:space="preserve">«Modelos del cuerpo»</w:t>
+      </w:r>
+      <w:r>
+        <w:t xml:space="preserve"> (huesos, músculos, piezas del atlas). Lo que se sube desde una pestaña cae en ella, y cada desplegable de modelo ofrece solo la suya: el del instrumento, herramientas; el de la cirugía, modelos del cuerpo. Para pasar un modelo de una carpeta a otra se edita y se cambia «Carpeta».</w:t>
+      </w:r>
+    </w:p>
+    <w:p>
+      <w:pPr>
+        <w:spacing w:after="120" w:line="288"/>
+      </w:pPr>
+      <w:r>
+        <w:rPr>
+          <w:b/>
+          <w:bCs/>
+        </w:rPr>
+        <w:t xml:space="preserve">Para el editor — la bandeja.</w:t>
+      </w:r>
+      <w:r>
+        <w:t xml:space="preserve"> Por omisión el residente ve </w:t>
+      </w:r>
+      <w:r>
+        <w:rPr>
+          <w:b/>
+          <w:bCs/>
+        </w:rPr>
+        <w:t xml:space="preserve">toda la mesa</w:t>
+      </w:r>
+      <w:r>
+        <w:t xml:space="preserve">: todo el instrumental del catálogo, agrupado por categoría, sin tener que ir metiéndolo. En la consola hay un interruptor sobre la bandeja: </w:t>
+      </w:r>
+      <w:r>
+        <w:rPr>
+          <w:b/>
+          <w:bCs/>
+        </w:rPr>
+        <w:t xml:space="preserve">«Toda la mesa»</w:t>
+      </w:r>
+      <w:r>
+        <w:t xml:space="preserve"> o </w:t>
+      </w:r>
+      <w:r>
+        <w:rPr>
+          <w:b/>
+          <w:bCs/>
+        </w:rPr>
+        <w:t xml:space="preserve">«Solo lo que elijo»</w:t>
+      </w:r>
+      <w:r>
+        <w:t xml:space="preserve">. Con «Solo lo que elijo» el residente ve únicamente lo que piden los pasos más lo que usted añada como señuelos; es lo que hay que usar para limitar la elección. Las cirugías que ya tenían su bandeja armada </w:t>
+      </w:r>
+      <w:r>
+        <w:rPr>
+          <w:b/>
+          <w:bCs/>
+        </w:rPr>
+        <w:t xml:space="preserve">la conservan</w:t>
+      </w:r>
+      <w:r>
+        <w:t xml:space="preserve">.</w:t>
+      </w:r>
+    </w:p>
+    <w:p>
+      <w:pPr>
+        <w:spacing w:after="120" w:line="288"/>
+      </w:pPr>
+      <w:r>
+        <w:t xml:space="preserve">Una cirugía nueva se opera sin rellenar las piezas: lo que la pestaña «Piezas» no declara toma la capa que trae el modelo (piel, músculo, hueso). Si una herramienta dice que «ninguna pieza de este modelo es piel» (o músculo, o hueso), el modelo no trae esa capa: márquela en «Piezas» o pulse «Rellenar desde el modelo».</w:t>
+      </w:r>
+    </w:p>
+    <w:p>
+      <w:pPr>
+        <w:pStyle w:val="Heading2"/>
+      </w:pPr>
+      <w:r>
+        <w:t xml:space="preserve">13.3 Insumos utilizados</w:t>
+      </w:r>
+    </w:p>
+    <w:p>
+      <w:pPr>
+        <w:spacing w:after="120" w:line="288"/>
+      </w:pPr>
+      <w:r>
+        <w:t xml:space="preserve">Al terminar el caso, la consola lista </w:t>
+      </w:r>
+      <w:r>
+        <w:rPr>
+          <w:b/>
+          <w:bCs/>
+        </w:rPr>
+        <w:t xml:space="preserve">lo que se usó</w:t>
+      </w:r>
+      <w:r>
+        <w:t xml:space="preserve"> —lo que hizo algo: cortó, separó, pinzó, perforó, midió, cosió o fijó; elegir un instrumento y soltarlo no cuenta—, por categoría y con los tornillos por tipo y largo. </w:t>
+      </w:r>
+      <w:r>
+        <w:rPr>
+          <w:b/>
+          <w:bCs/>
+        </w:rPr>
+        <w:t xml:space="preserve">Queda guardado con el recorrido</w:t>
+      </w:r>
+      <w:r>
+        <w:t xml:space="preserve">: al volver a abrir el caso, «Su recorrido anterior» muestra también los insumos.</w:t>
+      </w:r>
+    </w:p>
+    <w:p>
+      <w:pPr>
+        <w:spacing w:after="120" w:line="288"/>
+      </w:pPr>
+      <w:r>
+        <w:rPr>
+          <w:b/>
+          <w:bCs/>
+        </w:rPr>
+        <w:t xml:space="preserve">Para el editor.</w:t>
+      </w:r>
+      <w:r>
+        <w:t xml:space="preserve"> En el editor, cada instrumento de la bandeja lleva una casilla (lo usado, marcada; con «Solo lo que elijo», lo que estaba y no se usó, sin marcar) y el botón </w:t>
+      </w:r>
+      <w:r>
+        <w:rPr>
+          <w:b/>
+          <w:bCs/>
+        </w:rPr>
+        <w:t xml:space="preserve">«Usar como bandeja del caso»</w:t>
+      </w:r>
+      <w:r>
+        <w:t xml:space="preserve"> deja la bandeja exactamente con lo marcado y la pasa a «Solo lo que elijo». Sirve para armar la bandeja de un caso recorriéndolo una vez.</w:t>
+      </w:r>
+    </w:p>
+    <w:p>
+      <w:pPr>
+        <w:pStyle w:val="Heading2"/>
+      </w:pPr>
+      <w:r>
+        <w:t xml:space="preserve">13.4 Los modos, en una barra</w:t>
+      </w:r>
+    </w:p>
+    <w:p>
+      <w:pPr>
+        <w:spacing w:after="120" w:line="288"/>
+      </w:pPr>
+      <w:r>
+        <w:t xml:space="preserve">Los modos de ratón —</w:t>
+      </w:r>
+      <w:r>
+        <w:rPr>
+          <w:b/>
+          <w:bCs/>
+        </w:rPr>
+        <w:t xml:space="preserve">Orbitar, Trazar, Mover, Separar, Pinzar, Reducir, Perforar, Fijar, Coser, Disecar y Seleccionar estructura</w:t>
+      </w:r>
+      <w:r>
+        <w:t xml:space="preserve">— están en una barra sobre el lienzo, de izquierda a derecha, en el orden en que se hace una cirugía; solo salen los que el instrumento en la mano usa. Bajo la barra, una línea dice qué hace el modo; el que pide el paso lleva la marca «paso». En un lienzo estrecho la barra queda en iconos (el nombre sale al pasar el ratón).</w:t>
+      </w:r>
+    </w:p>
+    <w:p>
+      <w:pPr>
+        <w:spacing w:after="120" w:line="288"/>
+      </w:pPr>
+      <w:r>
+        <w:rPr>
+          <w:b/>
+          <w:bCs/>
+        </w:rPr>
+        <w:t xml:space="preserve">«Seleccionar estructura»</w:t>
+      </w:r>
+      <w:r>
+        <w:t xml:space="preserve"> (antes «Info») sirve para todos: un clic en una estructura (músculo, nervio, vaso, hueso) la destaca en azul y abre su ficha a la derecha del modelo, con el nombre, el nombre latino y «Aprenda más» (definición, origen, inserción, inervación, acción e irrigación). Quien edita ve además </w:t>
+      </w:r>
+      <w:r>
+        <w:rPr>
+          <w:b/>
+          <w:bCs/>
+        </w:rPr>
+        <w:t xml:space="preserve">«Editar»</w:t>
+      </w:r>
+      <w:r>
+        <w:t xml:space="preserve">, que abre la ficha para corregirla en el momento.</w:t>
+      </w:r>
+    </w:p>
+    <w:p>
+      <w:pPr>
+        <w:pStyle w:val="Heading2"/>
+      </w:pPr>
+      <w:r>
+        <w:t xml:space="preserve">13.5 Separar con un clic y trabajar por planos</w:t>
+      </w:r>
+    </w:p>
+    <w:p>
+      <w:pPr>
+        <w:pStyle w:val="ListParagraph"/>
+        <w:numPr>
+          <w:ilvl w:val="0"/>
+          <w:numId w:val="4"/>
+        </w:numPr>
+        <w:spacing w:after="90" w:line="280"/>
+      </w:pPr>
+      <w:r>
+        <w:t xml:space="preserve">Con un separador en la mano y el modo </w:t>
+      </w:r>
+      <w:r>
+        <w:rPr>
+          <w:b/>
+          <w:bCs/>
+        </w:rPr>
+        <w:t xml:space="preserve">Separar</w:t>
+      </w:r>
+      <w:r>
+        <w:t xml:space="preserve">, </w:t>
+      </w:r>
+      <w:r>
+        <w:rPr>
+          <w:b/>
+          <w:bCs/>
+        </w:rPr>
+        <w:t xml:space="preserve">un clic en un músculo lo retrae de una vez</w:t>
+      </w:r>
+      <w:r>
+        <w:t xml:space="preserve">, sin abrir la ficha ni elegir el plano; la rueda lo abre o lo cierra, y otro clic en otro músculo lo separa también sin soltar el anterior.</w:t>
+      </w:r>
+    </w:p>
+    <w:p>
+      <w:pPr>
+        <w:pStyle w:val="ListParagraph"/>
+        <w:numPr>
+          <w:ilvl w:val="0"/>
+          <w:numId w:val="4"/>
+        </w:numPr>
+        <w:spacing w:after="90" w:line="280"/>
+      </w:pPr>
+      <w:r>
+        <w:t xml:space="preserve">El plano lo decide el clic: sobre el </w:t>
+      </w:r>
+      <w:r>
+        <w:rPr>
+          <w:b/>
+          <w:bCs/>
+        </w:rPr>
+        <w:t xml:space="preserve">labio de una herida</w:t>
+      </w:r>
+      <w:r>
+        <w:t xml:space="preserve"> el separador va al plano que se ve (piel o músculo); lejos de todo labio y sobre un músculo, lo retrae. El selector del panel («Automático», «Piel», «Músculo») sigue ahí para forzarlo.</w:t>
+      </w:r>
+    </w:p>
+    <w:p>
+      <w:pPr>
+        <w:pStyle w:val="ListParagraph"/>
+        <w:numPr>
+          <w:ilvl w:val="0"/>
+          <w:numId w:val="4"/>
+        </w:numPr>
+        <w:spacing w:after="90" w:line="280"/>
+      </w:pPr>
+      <w:r>
+        <w:t xml:space="preserve">La lista </w:t>
+      </w:r>
+      <w:r>
+        <w:rPr>
+          <w:b/>
+          <w:bCs/>
+        </w:rPr>
+        <w:t xml:space="preserve">«Estructuras separadas»</w:t>
+      </w:r>
+      <w:r>
+        <w:t xml:space="preserve"> trae una fila por músculo: un clic en el nombre lo hace el que atiende la rueda, </w:t>
+      </w:r>
+      <w:r>
+        <w:rPr>
+          <w:b/>
+          <w:bCs/>
+        </w:rPr>
+        <w:t xml:space="preserve">«Otro lado»</w:t>
+      </w:r>
+      <w:r>
+        <w:t xml:space="preserve"> lo aparta hacia delante o hacia atrás, </w:t>
+      </w:r>
+      <w:r>
+        <w:rPr>
+          <w:b/>
+          <w:bCs/>
+        </w:rPr>
+        <w:t xml:space="preserve">«Cortar»</w:t>
+      </w:r>
+      <w:r>
+        <w:t xml:space="preserve"> pone el instrumento de corte en la mano y deja el músculo como objetivo del corte, y la X lo devuelve a su sitio. </w:t>
+      </w:r>
+      <w:r>
+        <w:rPr>
+          <w:b/>
+          <w:bCs/>
+        </w:rPr>
+        <w:t xml:space="preserve">Mayúsculas + rueda</w:t>
+      </w:r>
+      <w:r>
+        <w:t xml:space="preserve"> corre la zona retraída a lo largo del músculo.</w:t>
+      </w:r>
+    </w:p>
+    <w:p>
+      <w:pPr>
+        <w:pStyle w:val="ListParagraph"/>
+        <w:numPr>
+          <w:ilvl w:val="0"/>
+          <w:numId w:val="4"/>
+        </w:numPr>
+        <w:spacing w:after="90" w:line="280"/>
+      </w:pPr>
+      <w:r>
+        <w:rPr>
+          <w:b/>
+          <w:bCs/>
+        </w:rPr>
+        <w:t xml:space="preserve">Para el editor.</w:t>
+      </w:r>
+      <w:r>
+        <w:t xml:space="preserve"> Un paso puede evaluar </w:t>
+      </w:r>
+      <w:r>
+        <w:rPr>
+          <w:b/>
+          <w:bCs/>
+        </w:rPr>
+        <w:t xml:space="preserve">«Cortar o separar un músculo concreto»</w:t>
+      </w:r>
+      <w:r>
+        <w:t xml:space="preserve">: se escribe el nombre del objeto del músculo en el modelo y se elige si hay que cortarlo o separarlo. Un abordaje con dos planos son dos pasos seguidos; el orden de los planos también puede ser un objetivo de paso. En la ficha de cada músculo («Estructuras»), los campos «Cortar con» y «Separar con» dejan escritos los instrumentos que se ofrecen.</w:t>
+      </w:r>
+    </w:p>
+    <w:p>
+      <w:pPr>
+        <w:pStyle w:val="Heading2"/>
+      </w:pPr>
+      <w:r>
+        <w:t xml:space="preserve">13.6 La placa, los tornillos y los orificios</w:t>
+      </w:r>
+    </w:p>
+    <w:p>
+      <w:pPr>
+        <w:pStyle w:val="ListParagraph"/>
+        <w:numPr>
+          <w:ilvl w:val="0"/>
+          <w:numId w:val="4"/>
+        </w:numPr>
+        <w:spacing w:after="90" w:line="280"/>
+      </w:pPr>
+      <w:r>
+        <w:rPr>
+          <w:b/>
+          <w:bCs/>
+        </w:rPr>
+        <w:t xml:space="preserve">Una sola placa.</w:t>
+      </w:r>
+      <w:r>
+        <w:t xml:space="preserve"> Con una puesta, la que se lleva en la mano ya no sale al mover el ratón; «Quitar la placa» permite empezar otra. La placa se ajusta con tres campos que se </w:t>
+      </w:r>
+      <w:r>
+        <w:rPr>
+          <w:b/>
+          <w:bCs/>
+        </w:rPr>
+        <w:t xml:space="preserve">escriben</w:t>
+      </w:r>
+      <w:r>
+        <w:t xml:space="preserve"> —</w:t>
+      </w:r>
+      <w:r>
+        <w:rPr>
+          <w:b/>
+          <w:bCs/>
+        </w:rPr>
+        <w:t xml:space="preserve">proximal ↔ distal</w:t>
+      </w:r>
+      <w:r>
+        <w:t xml:space="preserve">, </w:t>
+      </w:r>
+      <w:r>
+        <w:rPr>
+          <w:b/>
+          <w:bCs/>
+        </w:rPr>
+        <w:t xml:space="preserve">anterior ↔ posterior</w:t>
+      </w:r>
+      <w:r>
+        <w:t xml:space="preserve"> y </w:t>
+      </w:r>
+      <w:r>
+        <w:rPr>
+          <w:b/>
+          <w:bCs/>
+        </w:rPr>
+        <w:t xml:space="preserve">angulación</w:t>
+      </w:r>
+      <w:r>
+        <w:t xml:space="preserve">— con una línea que lo dice como se habla en quirófano («75 mm hacia distal»). Los rangos salen del hueso que hay en pantalla. </w:t>
+      </w:r>
+      <w:r>
+        <w:rPr>
+          <w:b/>
+          <w:bCs/>
+        </w:rPr>
+        <w:t xml:space="preserve">«Fijar la placa»</w:t>
+      </w:r>
+      <w:r>
+        <w:t xml:space="preserve"> cierra el ajuste («Soltar» lo reabre).</w:t>
+      </w:r>
+    </w:p>
+    <w:p>
+      <w:pPr>
+        <w:pStyle w:val="ListParagraph"/>
+        <w:numPr>
+          <w:ilvl w:val="0"/>
+          <w:numId w:val="4"/>
+        </w:numPr>
+        <w:spacing w:after="90" w:line="280"/>
+      </w:pPr>
+      <w:r>
+        <w:rPr>
+          <w:b/>
+          <w:bCs/>
+        </w:rPr>
+        <w:t xml:space="preserve">El orden es perforar, medir y atornillar.</w:t>
+      </w:r>
+      <w:r>
+        <w:t xml:space="preserve"> La broca se centra en el agujero y anota diámetro, largo y si cruzó las dos corticales; el medidor deja anotada su lectura; el tornillo solo entra en un agujero perforado y medido, y si no la consola dice qué falta. Los tornillos, brocas, medidor y destornillador de la placa aparecen solos en la bandeja con la etiqueta «para esta placa».</w:t>
+      </w:r>
+    </w:p>
+    <w:p>
+      <w:pPr>
+        <w:pStyle w:val="ListParagraph"/>
+        <w:numPr>
+          <w:ilvl w:val="0"/>
+          <w:numId w:val="4"/>
+        </w:numPr>
+        <w:spacing w:after="90" w:line="280"/>
+      </w:pPr>
+      <w:r>
+        <w:rPr>
+          <w:b/>
+          <w:bCs/>
+        </w:rPr>
+        <w:t xml:space="preserve">Tornillos por tipo, diámetro y largo.</w:t>
+      </w:r>
+      <w:r>
+        <w:t xml:space="preserve"> En la bandeja salen separados por tipo (corticales, de esponjosa, de rosca parcial, bloqueados, canulados, otros). Al coger uno, el panel ofrece el </w:t>
+      </w:r>
+      <w:r>
+        <w:rPr>
+          <w:b/>
+          <w:bCs/>
+        </w:rPr>
+        <w:t xml:space="preserve">diámetro de una lista</w:t>
+      </w:r>
+      <w:r>
+        <w:t xml:space="preserve"> según su tipo (2,7 · 3,5 · 4,0 · 4,5 · 5,0 · 6,5 mm) y dice qué broca le corresponde; el </w:t>
+      </w:r>
+      <w:r>
+        <w:rPr>
+          <w:b/>
+          <w:bCs/>
+        </w:rPr>
+        <w:t xml:space="preserve">largo se escribe</w:t>
+      </w:r>
+      <w:r>
+        <w:t xml:space="preserve"> (con el sugerido del medidor ya puesto). Perforar con otro calibre avisa de que el agujero queda estrecho o ancho.</w:t>
+      </w:r>
+    </w:p>
+    <w:p>
+      <w:pPr>
+        <w:pStyle w:val="ListParagraph"/>
+        <w:numPr>
+          <w:ilvl w:val="0"/>
+          <w:numId w:val="4"/>
+        </w:numPr>
+        <w:spacing w:after="90" w:line="280"/>
+      </w:pPr>
+      <w:r>
+        <w:rPr>
+          <w:b/>
+          <w:bCs/>
+        </w:rPr>
+        <w:t xml:space="preserve">La secuencia se despliega sola.</w:t>
+      </w:r>
+      <w:r>
+        <w:t xml:space="preserve"> Al terminar un tiempo, el instrumento que sigue se abre en la bandeja (etiqueta «siguiente») y, con «Poner el siguiente en la mano» encendido, pasa a la mano: broca, medidor, tornillo y vuelta a la broca para el orificio siguiente.</w:t>
+      </w:r>
+    </w:p>
+    <w:p>
+      <w:pPr>
+        <w:pStyle w:val="ListParagraph"/>
+        <w:numPr>
+          <w:ilvl w:val="0"/>
+          <w:numId w:val="4"/>
+        </w:numPr>
+        <w:spacing w:after="90" w:line="280"/>
+      </w:pPr>
+      <w:r>
+        <w:rPr>
+          <w:b/>
+          <w:bCs/>
+        </w:rPr>
+        <w:t xml:space="preserve">Trayectoria de un tornillo con dos clics.</w:t>
+      </w:r>
+      <w:r>
+        <w:t xml:space="preserve"> Con la broca, el medidor o un tornillo en la mano, «Marcar la trayectoria» convierte los dos clics siguientes sobre el hueso en la entrada y la salida: queda dibujada una línea y la broca, el medidor y el tornillo la siguen, </w:t>
+      </w:r>
+      <w:r>
+        <w:rPr>
+          <w:b/>
+          <w:bCs/>
+        </w:rPr>
+        <w:t xml:space="preserve">sin placa</w:t>
+      </w:r>
+      <w:r>
+        <w:t xml:space="preserve">, para un tornillo de tracción entre fragmentos.</w:t>
+      </w:r>
+    </w:p>
+    <w:p>
+      <w:pPr>
+        <w:pStyle w:val="ListParagraph"/>
+        <w:numPr>
+          <w:ilvl w:val="0"/>
+          <w:numId w:val="4"/>
+        </w:numPr>
+        <w:spacing w:after="90" w:line="280"/>
+      </w:pPr>
+      <w:r>
+        <w:rPr>
+          <w:b/>
+          <w:bCs/>
+        </w:rPr>
+        <w:t xml:space="preserve">Para el editor — datos del instrumento.</w:t>
+      </w:r>
+      <w:r>
+        <w:t xml:space="preserve"> Si el modelo 3D de una placa </w:t>
+      </w:r>
+      <w:r>
+        <w:rPr>
+          <w:b/>
+          <w:bCs/>
+        </w:rPr>
+        <w:t xml:space="preserve">no trae la posición de sus agujeros</w:t>
+      </w:r>
+      <w:r>
+        <w:t xml:space="preserve">, se escribe </w:t>
+      </w:r>
+      <w:r>
+        <w:rPr>
+          <w:b/>
+          <w:bCs/>
+        </w:rPr>
+        <w:t xml:space="preserve">cuántos orificios tiene</w:t>
+      </w:r>
+      <w:r>
+        <w:t xml:space="preserve"> en su instrumento (campo </w:t>
+      </w:r>
+      <w:r>
+        <w:rPr>
+          <w:b/>
+          <w:bCs/>
+        </w:rPr>
+        <w:t xml:space="preserve">«Orificios de la placa»</w:t>
+      </w:r>
+      <w:r>
+        <w:t xml:space="preserve">, en el taller anatómico → Instrumental o en el catálogo): los agujeros se reparten a partes iguales a lo largo de la placa. Si el modelo sí los trae, mandan los del modelo y, si el número no coincide, la consola lo avisa. En un tornillo, </w:t>
+      </w:r>
+      <w:r>
+        <w:rPr>
+          <w:b/>
+          <w:bCs/>
+        </w:rPr>
+        <w:t xml:space="preserve">«Largo del tornillo (mm)»</w:t>
+      </w:r>
+      <w:r>
+        <w:t xml:space="preserve"> es el largo con que se ofrece al cogerlo y </w:t>
+      </w:r>
+      <w:r>
+        <w:rPr>
+          <w:b/>
+          <w:bCs/>
+        </w:rPr>
+        <w:t xml:space="preserve">«Tipo de tornillo»</w:t>
+      </w:r>
+      <w:r>
+        <w:t xml:space="preserve"> decide su grupo y sus diámetros; sin escribirlo, el tipo se deduce del nombre.</w:t>
+      </w:r>
+    </w:p>
+    <w:p>
+      <w:pPr>
+        <w:pStyle w:val="Heading2"/>
+      </w:pPr>
+      <w:r>
+        <w:t xml:space="preserve">13.7 Mover por ejes y reducción automática</w:t>
+      </w:r>
+    </w:p>
+    <w:p>
+      <w:pPr>
+        <w:spacing w:after="120" w:line="288"/>
+      </w:pPr>
+      <w:r>
+        <w:t xml:space="preserve">Con un trozo de hueso elegido —agarrado con la pinza de reducción o con «Mover → Un trozo»— aparece bajo los modos un menú de tres botones: </w:t>
+      </w:r>
+      <w:r>
+        <w:rPr>
+          <w:b/>
+          <w:bCs/>
+        </w:rPr>
+        <w:t xml:space="preserve">Trasladar</w:t>
+      </w:r>
+      <w:r>
+        <w:t xml:space="preserve"> (ejes coronal, axial y sagital), </w:t>
+      </w:r>
+      <w:r>
+        <w:rPr>
+          <w:b/>
+          <w:bCs/>
+        </w:rPr>
+        <w:t xml:space="preserve">Angular</w:t>
+      </w:r>
+      <w:r>
+        <w:t xml:space="preserve"> (coronal: varo/valgo; sagital: antecurvatum/recurvatum) y </w:t>
+      </w:r>
+      <w:r>
+        <w:rPr>
+          <w:b/>
+          <w:bCs/>
+        </w:rPr>
+        <w:t xml:space="preserve">Rotar</w:t>
+      </w:r>
+      <w:r>
+        <w:t xml:space="preserve"> (sobre el eje largo, la mala rotación). Los ejes son los del paciente: axial es a lo largo del hueso, coronal de lado a lado y sagital de delante atrás. Elegido un eje, el lienzo dibuja una sola línea y el trozo se mueve con las </w:t>
+      </w:r>
+      <w:r>
+        <w:rPr>
+          <w:b/>
+          <w:bCs/>
+        </w:rPr>
+        <w:t xml:space="preserve">flechas del teclado</w:t>
+      </w:r>
+      <w:r>
+        <w:t xml:space="preserve"> (1 mm o 1° por pulsación; Mayúsculas 0,2; Ctrl 5) o </w:t>
+      </w:r>
+      <w:r>
+        <w:rPr>
+          <w:b/>
+          <w:bCs/>
+        </w:rPr>
+        <w:t xml:space="preserve">arrastrando</w:t>
+      </w:r>
+      <w:r>
+        <w:t xml:space="preserve">. </w:t>
+      </w:r>
+      <w:r>
+        <w:rPr>
+          <w:b/>
+          <w:bCs/>
+        </w:rPr>
+        <w:t xml:space="preserve">Esc</w:t>
+      </w:r>
+      <w:r>
+        <w:t xml:space="preserve"> suelta el eje. Las asas de siempre quedan detrás del interruptor «Asas libres». Con la placa puesta y sin fijar sale el mismo menú.</w:t>
+      </w:r>
+    </w:p>
+    <w:p>
+      <w:pPr>
+        <w:spacing w:after="120" w:line="288"/>
+      </w:pPr>
+      <w:r>
+        <w:t xml:space="preserve">Con una pinza de reducción en la mano, el panel ofrece </w:t>
+      </w:r>
+      <w:r>
+        <w:rPr>
+          <w:b/>
+          <w:bCs/>
+        </w:rPr>
+        <w:t xml:space="preserve">Manual</w:t>
+      </w:r>
+      <w:r>
+        <w:t xml:space="preserve"> (por omisión) y </w:t>
+      </w:r>
+      <w:r>
+        <w:rPr>
+          <w:b/>
+          <w:bCs/>
+        </w:rPr>
+        <w:t xml:space="preserve">Automática</w:t>
+      </w:r>
+      <w:r>
+        <w:t xml:space="preserve">. La automática lleva el fragmento a su sitio en 0,6 s y deja el desplazamiento, la angulación y la diástasis en 0. </w:t>
+      </w:r>
+      <w:r>
+        <w:rPr>
+          <w:b/>
+          <w:bCs/>
+        </w:rPr>
+        <w:t xml:space="preserve">El ejercicio de reducir no puntúa</w:t>
+      </w:r>
+      <w:r>
+        <w:t xml:space="preserve"> con la automática (a mano sigue puntuando), y el recorrido guarda que se usó: «Su recorrido anterior» lo dice. Es útil cuando el objetivo de la clase es otro.</w:t>
+      </w:r>
+    </w:p>
+    <w:p>
+      <w:pPr>
+        <w:pStyle w:val="Heading2"/>
+      </w:pPr>
+      <w:r>
+        <w:t xml:space="preserve">13.8 La broca y el medidor se quedan puestos</w:t>
+      </w:r>
+    </w:p>
+    <w:p>
+      <w:pPr>
+        <w:spacing w:after="120" w:line="288"/>
+      </w:pPr>
+      <w:r>
+        <w:t xml:space="preserve">Al soltar, </w:t>
+      </w:r>
+      <w:r>
+        <w:rPr>
+          <w:b/>
+          <w:bCs/>
+        </w:rPr>
+        <w:t xml:space="preserve">la broca se queda puesta en el hoyo</w:t>
+      </w:r>
+      <w:r>
+        <w:t xml:space="preserve"> —no se retira—: se puede salir del lienzo a pulsar «Disparar» y la imagen la enseña a la profundidad en que estaba, que es para lo que sirve el rayo. Se sigue metiendo manteniendo pulsado o con la rueda (0,5 mm por muesca; con Mayúsculas, 0,1; hacia atrás la saca). </w:t>
+      </w:r>
+      <w:r>
+        <w:rPr>
+          <w:b/>
+          <w:bCs/>
+        </w:rPr>
+        <w:t xml:space="preserve">«Apagar la broca»</w:t>
+      </w:r>
+      <w:r>
+        <w:t xml:space="preserve"> (o Espacio) la detiene sin retirarla; </w:t>
+      </w:r>
+      <w:r>
+        <w:rPr>
+          <w:b/>
+          <w:bCs/>
+        </w:rPr>
+        <w:t xml:space="preserve">«Retirar»</w:t>
+      </w:r>
+      <w:r>
+        <w:t xml:space="preserve">, </w:t>
+      </w:r>
+      <w:r>
+        <w:rPr>
+          <w:b/>
+          <w:bCs/>
+        </w:rPr>
+        <w:t xml:space="preserve">Esc</w:t>
+      </w:r>
+      <w:r>
+        <w:t xml:space="preserve"> o el </w:t>
+      </w:r>
+      <w:r>
+        <w:rPr>
+          <w:b/>
+          <w:bCs/>
+        </w:rPr>
+        <w:t xml:space="preserve">botón derecho</w:t>
+      </w:r>
+      <w:r>
+        <w:t xml:space="preserve"> la sacan, y queda el túnel con calibre, profundidad, si fue bicortical y el ángulo. El medidor posado en un orificio perforado también se queda ahí mientras se pide el disparo. Cambiar de instrumento o de modo con una puesta la retira.</w:t>
+      </w:r>
+    </w:p>
+    <w:p>
+      <w:pPr>
+        <w:pStyle w:val="Heading2"/>
+      </w:pPr>
+      <w:r>
+        <w:t xml:space="preserve">13.9 Compresión de la fractura</w:t>
+      </w:r>
+    </w:p>
+    <w:p>
+      <w:pPr>
+        <w:spacing w:after="120" w:line="288"/>
+      </w:pPr>
+      <w:r>
+        <w:t xml:space="preserve">Con una </w:t>
+      </w:r>
+      <w:r>
+        <w:rPr>
+          <w:b/>
+          <w:bCs/>
+        </w:rPr>
+        <w:t xml:space="preserve">placa de compresión</w:t>
+      </w:r>
+      <w:r>
+        <w:t xml:space="preserve"> (DCP o LC-DCP: orificios ovales; LCP: combinados) fijada, el panel enseña el </w:t>
+      </w:r>
+      <w:r>
+        <w:rPr>
+          <w:b/>
+          <w:bCs/>
+        </w:rPr>
+        <w:t xml:space="preserve">orificio oval</w:t>
+      </w:r>
+      <w:r>
+        <w:t xml:space="preserve"> en un esquema con una flecha hacia la fractura. Se elige el orificio y se hace </w:t>
+      </w:r>
+      <w:r>
+        <w:rPr>
+          <w:b/>
+          <w:bCs/>
+        </w:rPr>
+        <w:t xml:space="preserve">clic dentro del óvalo</w:t>
+      </w:r>
+      <w:r>
+        <w:t xml:space="preserve"> para marcar dónde se broca; el texto dice si es:</w:t>
+      </w:r>
+    </w:p>
+    <w:p>
+      <w:pPr>
+        <w:pStyle w:val="ListParagraph"/>
+        <w:numPr>
+          <w:ilvl w:val="0"/>
+          <w:numId w:val="4"/>
+        </w:numPr>
+        <w:spacing w:after="90" w:line="280"/>
+      </w:pPr>
+      <w:r>
+        <w:rPr>
+          <w:b/>
+          <w:bCs/>
+        </w:rPr>
+        <w:t xml:space="preserve">céntrico:</w:t>
+      </w:r>
+      <w:r>
+        <w:t xml:space="preserve"> no comprime;</w:t>
+      </w:r>
+    </w:p>
+    <w:p>
+      <w:pPr>
+        <w:pStyle w:val="ListParagraph"/>
+        <w:numPr>
+          <w:ilvl w:val="0"/>
+          <w:numId w:val="4"/>
+        </w:numPr>
+        <w:spacing w:after="90" w:line="280"/>
+      </w:pPr>
+      <w:r>
+        <w:rPr>
+          <w:b/>
+          <w:bCs/>
+        </w:rPr>
+        <w:t xml:space="preserve">concéntrico hacia la fractura:</w:t>
+      </w:r>
+      <w:r>
+        <w:t xml:space="preserve"> no comprime y tiende a separar;</w:t>
+      </w:r>
+    </w:p>
+    <w:p>
+      <w:pPr>
+        <w:pStyle w:val="ListParagraph"/>
+        <w:numPr>
+          <w:ilvl w:val="0"/>
+          <w:numId w:val="4"/>
+        </w:numPr>
+        <w:spacing w:after="90" w:line="280"/>
+      </w:pPr>
+      <w:r>
+        <w:rPr>
+          <w:b/>
+          <w:bCs/>
+        </w:rPr>
+        <w:t xml:space="preserve">excéntrico, lejos de la fractura:</w:t>
+      </w:r>
+      <w:r>
+        <w:t xml:space="preserve"> comprime, hasta 1 mm por tornillo.</w:t>
+      </w:r>
+    </w:p>
+    <w:p>
+      <w:pPr>
+        <w:spacing w:after="120" w:line="288"/>
+      </w:pPr>
+      <w:r>
+        <w:t xml:space="preserve">«Acercar al orificio» lleva la cámara a él y «Volver la vista» la devuelve. La broca entra donde se eligió; al poner el tornillo (no bloqueado) </w:t>
+      </w:r>
+      <w:r>
+        <w:rPr>
+          <w:b/>
+          <w:bCs/>
+        </w:rPr>
+        <w:t xml:space="preserve">el fragmento se desliza hacia su sitio y la diástasis baja</w:t>
+      </w:r>
+      <w:r>
+        <w:t xml:space="preserve"> lo comprimido, sin pasar de lo que hay separado. Con un </w:t>
+      </w:r>
+      <w:r>
+        <w:rPr>
+          <w:b/>
+          <w:bCs/>
+        </w:rPr>
+        <w:t xml:space="preserve">tornillo de tracción</w:t>
+      </w:r>
+      <w:r>
+        <w:t xml:space="preserve"> por una trayectoria de dos clics que cruza la fractura hay dos formas de comprimir: la </w:t>
+      </w:r>
+      <w:r>
+        <w:rPr>
+          <w:b/>
+          <w:bCs/>
+        </w:rPr>
+        <w:t xml:space="preserve">broca de deslizamiento</w:t>
+      </w:r>
+      <w:r>
+        <w:t xml:space="preserve"> (el fragmento cercano con un calibre no menor que el diámetro exterior y el lejano con el de núcleo, perforando en dos tiempos) o un tornillo de </w:t>
+      </w:r>
+      <w:r>
+        <w:rPr>
+          <w:b/>
+          <w:bCs/>
+        </w:rPr>
+        <w:t xml:space="preserve">rosca parcial</w:t>
+      </w:r>
+      <w:r>
+        <w:t xml:space="preserve"> con toda la rosca en el fragmento lejano; si la rosca cruza la fractura, no comprime y la consola dice por qué. El panel suma lo comprimido («Compresión: 1,0 mm (tornillo excéntrico)»).</w:t>
+      </w:r>
+    </w:p>
+    <w:p>
+      <w:pPr>
+        <w:spacing w:after="120" w:line="288"/>
+      </w:pPr>
+      <w:r>
+        <w:rPr>
+          <w:b/>
+          <w:bCs/>
+        </w:rPr>
+        <w:t xml:space="preserve">Para el editor.</w:t>
+      </w:r>
+      <w:r>
+        <w:t xml:space="preserve"> Un paso de fijación puede </w:t>
+      </w:r>
+      <w:r>
+        <w:rPr>
+          <w:b/>
+          <w:bCs/>
+        </w:rPr>
+        <w:t xml:space="preserve">exigir comprimir</w:t>
+      </w:r>
+      <w:r>
+        <w:t xml:space="preserve">: casilla </w:t>
+      </w:r>
+      <w:r>
+        <w:rPr>
+          <w:b/>
+          <w:bCs/>
+        </w:rPr>
+        <w:t xml:space="preserve">«La fijación tiene que comprimir la fractura»</w:t>
+      </w:r>
+      <w:r>
+        <w:t xml:space="preserve">. Sin marcarla, el paso no mira la compresión. </w:t>
+      </w:r>
+      <w:r>
+        <w:rPr>
+          <w:b/>
+          <w:bCs/>
+        </w:rPr>
+        <w:t xml:space="preserve">Importante:</w:t>
+      </w:r>
+      <w:r>
+        <w:t xml:space="preserve"> las reglas (qué tan lejos del centro es «excéntrico», cuánto comprime cada tornillo) son una primera propuesta y </w:t>
+      </w:r>
+      <w:r>
+        <w:rPr>
+          <w:b/>
+          <w:bCs/>
+        </w:rPr>
+        <w:t xml:space="preserve">deben ser validadas por el traumatólogo</w:t>
+      </w:r>
+      <w:r>
+        <w:t xml:space="preserve">; están escritas en un solo archivo para poder corregirlas.</w:t>
+      </w:r>
+    </w:p>
+    <w:p>
+      <w:pPr>
+        <w:pStyle w:val="Heading2"/>
+      </w:pPr>
+      <w:r>
+        <w:t xml:space="preserve">13.10 Radiografía postoperatoria y lámina para presentar</w:t>
+      </w:r>
+    </w:p>
+    <w:p>
+      <w:pPr>
+        <w:spacing w:after="120" w:line="288"/>
+      </w:pPr>
+      <w:r>
+        <w:t xml:space="preserve">Al terminar el último paso, la consola dice </w:t>
+      </w:r>
+      <w:r>
+        <w:rPr>
+          <w:b/>
+          <w:bCs/>
+        </w:rPr>
+        <w:t xml:space="preserve">«Cirugía finalizada. ¡Felicidades!»</w:t>
+      </w:r>
+      <w:r>
+        <w:t xml:space="preserve"> y ofrece </w:t>
+      </w:r>
+      <w:r>
+        <w:rPr>
+          <w:b/>
+          <w:bCs/>
+        </w:rPr>
+        <w:t xml:space="preserve">Ir a radiografía postoperatoria</w:t>
+      </w:r>
+      <w:r>
+        <w:t xml:space="preserve"> (o </w:t>
+      </w:r>
+      <w:r>
+        <w:rPr>
+          <w:b/>
+          <w:bCs/>
+        </w:rPr>
+        <w:t xml:space="preserve">Omitir</w:t>
+      </w:r>
+      <w:r>
+        <w:t xml:space="preserve">, que deja el cierre de siempre). El editor, que ensaya, no ve esta invitación.</w:t>
+      </w:r>
+    </w:p>
+    <w:p>
+      <w:pPr>
+        <w:pStyle w:val="ListParagraph"/>
+        <w:numPr>
+          <w:ilvl w:val="0"/>
+          <w:numId w:val="4"/>
+        </w:numPr>
+        <w:spacing w:after="90" w:line="280"/>
+      </w:pPr>
+      <w:r>
+        <w:rPr>
+          <w:b/>
+          <w:bCs/>
+        </w:rPr>
+        <w:t xml:space="preserve">La toma.</w:t>
+      </w:r>
+      <w:r>
+        <w:t xml:space="preserve"> Se elige la proyección (AP, lateral u oblicua), el zoom, la penetración (kV) y el contraste. La placa es </w:t>
+      </w:r>
+      <w:r>
+        <w:rPr>
+          <w:b/>
+          <w:bCs/>
+        </w:rPr>
+        <w:t xml:space="preserve">rectangular (3 : 4) y en positivo</w:t>
+      </w:r>
+      <w:r>
+        <w:t xml:space="preserve">: el hueso y el metal salen blancos sobre negro, distinta del círculo de la fluoroscopia. No cuenta exposición. Caben </w:t>
+      </w:r>
+      <w:r>
+        <w:rPr>
+          <w:b/>
+          <w:bCs/>
+        </w:rPr>
+        <w:t xml:space="preserve">hasta tres</w:t>
+      </w:r>
+      <w:r>
+        <w:t xml:space="preserve"> en la lámina y cada una se puede quitar.</w:t>
+      </w:r>
+    </w:p>
+    <w:p>
+      <w:pPr>
+        <w:pStyle w:val="ListParagraph"/>
+        <w:numPr>
+          <w:ilvl w:val="0"/>
+          <w:numId w:val="4"/>
+        </w:numPr>
+        <w:spacing w:after="90" w:line="280"/>
+      </w:pPr>
+      <w:r>
+        <w:rPr>
+          <w:b/>
+          <w:bCs/>
+        </w:rPr>
+        <w:t xml:space="preserve">Los datos.</w:t>
+      </w:r>
+      <w:r>
+        <w:t xml:space="preserve"> </w:t>
+      </w:r>
+      <w:r>
+        <w:rPr>
+          <w:b/>
+          <w:bCs/>
+        </w:rPr>
+        <w:t xml:space="preserve">Cirujano</w:t>
+      </w:r>
+      <w:r>
+        <w:t xml:space="preserve"> (precargado con el nombre de la cuenta; el «Dr.» lo pone la lámina), </w:t>
+      </w:r>
+      <w:r>
+        <w:rPr>
+          <w:b/>
+          <w:bCs/>
+        </w:rPr>
+        <w:t xml:space="preserve">fractura</w:t>
+      </w:r>
+      <w:r>
+        <w:t xml:space="preserve"> (autocompletada con el hueso y la clasificación del caso), </w:t>
+      </w:r>
+      <w:r>
+        <w:rPr>
+          <w:b/>
+          <w:bCs/>
+        </w:rPr>
+        <w:t xml:space="preserve">intervención</w:t>
+      </w:r>
+      <w:r>
+        <w:t xml:space="preserve"> (propuesta según lo usado, por ejemplo «Reducción abierta y osteosíntesis con placa DCP 4,5 mm y 6 tornillos»; se corrige o se elige una frase de la lista) y, si se quiere, el equipo.</w:t>
+      </w:r>
+    </w:p>
+    <w:p>
+      <w:pPr>
+        <w:pStyle w:val="ListParagraph"/>
+        <w:numPr>
+          <w:ilvl w:val="0"/>
+          <w:numId w:val="4"/>
+        </w:numPr>
+        <w:spacing w:after="90" w:line="280"/>
+      </w:pPr>
+      <w:r>
+        <w:rPr>
+          <w:b/>
+          <w:bCs/>
+        </w:rPr>
+        <w:t xml:space="preserve">La lámina.</w:t>
+      </w:r>
+      <w:r>
+        <w:t xml:space="preserve"> «Descargar lámina (PNG)» baja una imagen de </w:t>
+      </w:r>
+      <w:r>
+        <w:rPr>
+          <w:b/>
+          <w:bCs/>
+        </w:rPr>
+        <w:t xml:space="preserve">1920 × 1080 con fondo negro</w:t>
+      </w:r>
+      <w:r>
+        <w:t xml:space="preserve">: el caso, el diagnóstico, la intervención, el cirujano, la fecha, el logotipo de TraumaHub y las radiografías. </w:t>
+      </w:r>
+      <w:r>
+        <w:rPr>
+          <w:b/>
+          <w:bCs/>
+        </w:rPr>
+        <w:t xml:space="preserve">No lleva los insumos ni el puntaje.</w:t>
+      </w:r>
+      <w:r>
+        <w:t xml:space="preserve"> Pensada para la diapositiva de la reunión clínica.</w:t>
+      </w:r>
+    </w:p>
+    <w:p>
+      <w:pPr>
+        <w:pStyle w:val="ListParagraph"/>
+        <w:numPr>
+          <w:ilvl w:val="0"/>
+          <w:numId w:val="4"/>
+        </w:numPr>
+        <w:spacing w:after="90" w:line="280"/>
+      </w:pPr>
+      <w:r>
+        <w:rPr>
+          <w:b/>
+          <w:bCs/>
+        </w:rPr>
+        <w:t xml:space="preserve">Dentro del archivo.</w:t>
+      </w:r>
+      <w:r>
+        <w:t xml:space="preserve"> Los mismos datos (autor, título, descripción, fecha) van como metadatos del PNG, de modo que acompañan a la imagen aunque se renombre. Los datos escritos se guardan con el recorrido —no la imagen—; así se podrá contar más adelante cuántas cirugías hizo cada estudiante.</w:t>
+      </w:r>
+    </w:p>
+    <w:p>
+      <w:pPr>
+        <w:pStyle w:val="Heading2"/>
+      </w:pPr>
+      <w:r>
+        <w:t xml:space="preserve">13.11 Lo que conviene saber al editar</w:t>
+      </w:r>
+    </w:p>
+    <w:p>
+      <w:pPr>
+        <w:pStyle w:val="ListParagraph"/>
+        <w:numPr>
+          <w:ilvl w:val="0"/>
+          <w:numId w:val="4"/>
+        </w:numPr>
+        <w:spacing w:after="90" w:line="280"/>
+      </w:pPr>
+      <w:r>
+        <w:t xml:space="preserve">Los campos nuevos del instrumento («Orificios de la placa», «Largo del tornillo (mm)», «Tipo de tornillo») y del paso («La fijación tiene que comprimir la fractura») son </w:t>
+      </w:r>
+      <w:r>
+        <w:rPr>
+          <w:b/>
+          <w:bCs/>
+        </w:rPr>
+        <w:t xml:space="preserve">opcionales</w:t>
+      </w:r>
+      <w:r>
+        <w:t xml:space="preserve">: sin escribirlos, todo funciona como antes.</w:t>
+      </w:r>
+    </w:p>
+    <w:p>
+      <w:pPr>
+        <w:pStyle w:val="ListParagraph"/>
+        <w:numPr>
+          <w:ilvl w:val="0"/>
+          <w:numId w:val="4"/>
+        </w:numPr>
+        <w:spacing w:after="90" w:line="280"/>
+      </w:pPr>
+      <w:r>
+        <w:t xml:space="preserve">Si la pantalla del lienzo se queda en blanco, la plataforma ahora recupera el contexto gráfico o vuelve a montar la escena y lo dice, en vez de quedarse muda.</w:t>
+      </w:r>
+    </w:p>
+    <w:p>
+      <w:pPr>
+        <w:pStyle w:val="ListParagraph"/>
+        <w:numPr>
+          <w:ilvl w:val="0"/>
+          <w:numId w:val="4"/>
+        </w:numPr>
+        <w:spacing w:after="90" w:line="280"/>
+      </w:pPr>
+      <w:r>
+        <w:t xml:space="preserve">Los tornillos largos, la broca que se pasa de la cortical y la fijación sin compresión (si el paso la exige) son complicaciones que se registran en «Su recorrido anterior».</w:t>
+      </w:r>
+    </w:p>
+    <w:p>
+      <w:pPr>
+        <w:spacing w:after="120" w:line="288"/>
+      </w:pPr>
+      <w:r>
+        <w:t xml:space="preserve">Este capítulo describe la plataforma al 21 de octubre de 2026. Si una pantalla es distinta de lo que aquí se dice, avise para actualizar el manual.</w:t>
+      </w:r>
+    </w:p>
+    <w:p>
+      <w:pPr>
+        <w:pStyle w:val="Heading1"/>
+        <w:pageBreakBefore/>
+      </w:pPr>
       <w:bookmarkStart w:name="anexo" w:id="13"/>
       <w:r>
         <w:t xml:space="preserve">Anexos</w:t>
@@ -22446,7 +24011,7 @@
         <w:sz w:val="17"/>
         <w:szCs w:val="17"/>
       </w:rPr>
-      <w:t xml:space="preserve">Versión 1.3 · octubre de 2026</w:t>
+      <w:t xml:space="preserve">Versión 1.4 · octubre de 2026</w:t>
     </w:r>
     <w:r>
       <w:rPr>
@@ -22523,6 +24088,49 @@
         <w:tab w:val="right" w:pos="9360"/>
       </w:tabs>
     </w:pPr>
+    <w:r>
+      <w:rPr>
+        <w:noProof/>
+      </w:rPr>
+      <w:drawing>
+        <wp:inline distT="0" distB="0" distL="0" distR="0">
+          <wp:extent cx="357500" cy="260000"/>
+          <wp:effectExtent t="0" r="0" b="0" l="0"/>
+          <wp:docPr id="9902" name="logo-traumahub" descr="Logotipo de TraumaHub"/>
+          <wp:cNvGraphicFramePr>
+            <a:graphicFrameLocks xmlns:a="http://schemas.openxmlformats.org/drawingml/2006/main" noChangeAspect="1"/>
+          </wp:cNvGraphicFramePr>
+          <a:graphic xmlns:a="http://schemas.openxmlformats.org/drawingml/2006/main">
+            <a:graphicData uri="http://schemas.openxmlformats.org/drawingml/2006/picture">
+              <pic:pic xmlns:pic="http://schemas.openxmlformats.org/drawingml/2006/picture">
+                <pic:nvPicPr>
+                  <pic:cNvPr id="0" name="logo"/>
+                  <pic:cNvPicPr/>
+                </pic:nvPicPr>
+                <pic:blipFill>
+                  <a:blip r:embed="rId1"/>
+                  <a:stretch>
+                    <a:fillRect/>
+                  </a:stretch>
+                </pic:blipFill>
+                <pic:spPr>
+                  <a:xfrm>
+                    <a:off x="0" y="0"/>
+                    <a:ext cx="357500" cy="260000"/>
+                  </a:xfrm>
+                  <a:prstGeom prst="rect">
+                    <a:avLst/>
+                  </a:prstGeom>
+                </pic:spPr>
+              </pic:pic>
+            </a:graphicData>
+          </a:graphic>
+        </wp:inline>
+      </w:drawing>
+    </w:r>
+    <w:r>
+      <w:t xml:space="preserve"> </w:t>
+    </w:r>
     <w:r>
       <w:rPr>
         <w:b/>

</xml_diff>

<commit_message>
feat(simulador): el Freer y los periostótomos despegan el periostio, con modo Elevar y un consejo al fijar la placa (D-208, P-005 E2)
Co-Authored-By: Claude Sonnet 5.5 <noreply@anthropic.com>
</commit_message>
<xml_diff>
--- a/docs/MANUAL-DEL-SIMULADOR-QUIRURGICO.docx
+++ b/docs/MANUAL-DEL-SIMULADOR-QUIRURGICO.docx
@@ -21841,7 +21841,139 @@
         <w:pStyle w:val="Heading2"/>
       </w:pPr>
       <w:r>
-        <w:t xml:space="preserve">13.13 Lo que conviene saber al editar</w:t>
+        <w:t xml:space="preserve">13.13 Despegar el periostio</w:t>
+      </w:r>
+    </w:p>
+    <w:p>
+      <w:pPr>
+        <w:spacing w:after="120" w:line="288"/>
+      </w:pPr>
+      <w:r>
+        <w:t xml:space="preserve">El </w:t>
+      </w:r>
+      <w:r>
+        <w:rPr>
+          <w:b/>
+          <w:bCs/>
+        </w:rPr>
+        <w:t xml:space="preserve">elevador de Freer</w:t>
+      </w:r>
+      <w:r>
+        <w:t xml:space="preserve"> (hojas de 3 y 5 mm), el </w:t>
+      </w:r>
+      <w:r>
+        <w:rPr>
+          <w:b/>
+          <w:bCs/>
+        </w:rPr>
+        <w:t xml:space="preserve">periostótomo AO / Lambotte</w:t>
+      </w:r>
+      <w:r>
+        <w:t xml:space="preserve"> (6 y 14 mm) y el </w:t>
+      </w:r>
+      <w:r>
+        <w:rPr>
+          <w:b/>
+          <w:bCs/>
+        </w:rPr>
+        <w:t xml:space="preserve">periostótomo de Farabeuf</w:t>
+      </w:r>
+      <w:r>
+        <w:t xml:space="preserve"> (11 y 15 mm) despegan el periostio de la cortical, como se hace antes de apoyar una placa. Al cogerlos el modo pasa a </w:t>
+      </w:r>
+      <w:r>
+        <w:rPr>
+          <w:b/>
+          <w:bCs/>
+        </w:rPr>
+        <w:t xml:space="preserve">«Elevar»</w:t>
+      </w:r>
+      <w:r>
+        <w:t xml:space="preserve">.</w:t>
+      </w:r>
+    </w:p>
+    <w:p>
+      <w:pPr>
+        <w:pStyle w:val="ListParagraph"/>
+        <w:numPr>
+          <w:ilvl w:val="0"/>
+          <w:numId w:val="4"/>
+        </w:numPr>
+        <w:spacing w:after="90" w:line="280"/>
+      </w:pPr>
+      <w:r>
+        <w:t xml:space="preserve">Se elige la </w:t>
+      </w:r>
+      <w:r>
+        <w:rPr>
+          <w:b/>
+          <w:bCs/>
+        </w:rPr>
+        <w:t xml:space="preserve">hoja</w:t>
+      </w:r>
+      <w:r>
+        <w:t xml:space="preserve"> en el recuadro, se </w:t>
+      </w:r>
+      <w:r>
+        <w:rPr>
+          <w:b/>
+          <w:bCs/>
+        </w:rPr>
+        <w:t xml:space="preserve">mantiene pulsado y se arrastra sobre el hueso</w:t>
+      </w:r>
+      <w:r>
+        <w:t xml:space="preserve">, y queda una franja clara —del ancho de la hoja— donde el hueso ya no tiene periostio. Para verla hay que apagar la capa «Músculo».</w:t>
+      </w:r>
+    </w:p>
+    <w:p>
+      <w:pPr>
+        <w:pStyle w:val="ListParagraph"/>
+        <w:numPr>
+          <w:ilvl w:val="0"/>
+          <w:numId w:val="4"/>
+        </w:numPr>
+        <w:spacing w:after="90" w:line="280"/>
+      </w:pPr>
+      <w:r>
+        <w:t xml:space="preserve">El recuadro dice cuánto se despegó («Expuesto: unos 390 mm²»); </w:t>
+      </w:r>
+      <w:r>
+        <w:rPr>
+          <w:b/>
+          <w:bCs/>
+        </w:rPr>
+        <w:t xml:space="preserve">«Volver a cubrir el hueso»</w:t>
+      </w:r>
+      <w:r>
+        <w:t xml:space="preserve"> lo borra.</w:t>
+      </w:r>
+    </w:p>
+    <w:p>
+      <w:pPr>
+        <w:pStyle w:val="ListParagraph"/>
+        <w:numPr>
+          <w:ilvl w:val="0"/>
+          <w:numId w:val="4"/>
+        </w:numPr>
+        <w:spacing w:after="90" w:line="280"/>
+      </w:pPr>
+      <w:r>
+        <w:rPr>
+          <w:b/>
+          <w:bCs/>
+        </w:rPr>
+        <w:t xml:space="preserve">Al fijar la placa</w:t>
+      </w:r>
+      <w:r>
+        <w:t xml:space="preserve">, la consola avisa si no se despegó nada, qué agujeros caen sobre periostio sin despegar y si se despegó de más (sobre unos 2.500 mm² el hueso empieza a perder irrigación). Es un consejo, no una traba. Las cifras son una propuesta que el traumatólogo debe revisar.</w:t>
+      </w:r>
+    </w:p>
+    <w:p>
+      <w:pPr>
+        <w:pStyle w:val="Heading2"/>
+      </w:pPr>
+      <w:r>
+        <w:t xml:space="preserve">13.14 Lo que conviene saber al editar</w:t>
       </w:r>
     </w:p>
     <w:p>

</xml_diff>

<commit_message>
feat(simulador): la aguja de Kirschner se queda puesta en el hueso y se juzga (D-209, P-005 E3)
Al retirar el motor, la aguja no deja un hoyo sino un alambre que la
fluoroscopia ve. El recuadro lista cada una y avisa si quedó en la cortical
cercana o se pasó de la opuesta. Camisa y motor quedan pendientes.

Co-Authored-By: Claude Sonnet 5.5 <noreply@anthropic.com>
</commit_message>
<xml_diff>
--- a/docs/MANUAL-DEL-SIMULADOR-QUIRURGICO.docx
+++ b/docs/MANUAL-DEL-SIMULADOR-QUIRURGICO.docx
@@ -21973,7 +21973,122 @@
         <w:pStyle w:val="Heading2"/>
       </w:pPr>
       <w:r>
-        <w:t xml:space="preserve">13.14 Lo que conviene saber al editar</w:t>
+        <w:t xml:space="preserve">13.14 La aguja de Kirschner</w:t>
+      </w:r>
+    </w:p>
+    <w:p>
+      <w:pPr>
+        <w:spacing w:after="120" w:line="288"/>
+      </w:pPr>
+      <w:r>
+        <w:t xml:space="preserve">La </w:t>
+      </w:r>
+      <w:r>
+        <w:rPr>
+          <w:b/>
+          <w:bCs/>
+        </w:rPr>
+        <w:t xml:space="preserve">aguja de Kirschner</w:t>
+      </w:r>
+      <w:r>
+        <w:t xml:space="preserve"> (1,6 mm) se clava con el motor y, a diferencia de una broca, </w:t>
+      </w:r>
+      <w:r>
+        <w:rPr>
+          <w:b/>
+          <w:bCs/>
+        </w:rPr>
+        <w:t xml:space="preserve">se queda puesta</w:t>
+      </w:r>
+      <w:r>
+        <w:t xml:space="preserve">: al «Retirar» el motor, la aguja sigue clavada, se ve en la escena y en la fluoroscopia y asoma por fuera del hueso.</w:t>
+      </w:r>
+    </w:p>
+    <w:p>
+      <w:pPr>
+        <w:pStyle w:val="ListParagraph"/>
+        <w:numPr>
+          <w:ilvl w:val="0"/>
+          <w:numId w:val="4"/>
+        </w:numPr>
+        <w:spacing w:after="90" w:line="280"/>
+      </w:pPr>
+      <w:r>
+        <w:t xml:space="preserve">Se apunta al hueso, se </w:t>
+      </w:r>
+      <w:r>
+        <w:rPr>
+          <w:b/>
+          <w:bCs/>
+        </w:rPr>
+        <w:t xml:space="preserve">mantiene pulsado</w:t>
+      </w:r>
+      <w:r>
+        <w:t xml:space="preserve"> y avanza. El recuadro de la herramienta lista cada aguja («Aguja 2 · 26,5 mm · bicortical · asoma 123 mm»).</w:t>
+      </w:r>
+    </w:p>
+    <w:p>
+      <w:pPr>
+        <w:pStyle w:val="ListParagraph"/>
+        <w:numPr>
+          <w:ilvl w:val="0"/>
+          <w:numId w:val="4"/>
+        </w:numPr>
+        <w:spacing w:after="90" w:line="280"/>
+      </w:pPr>
+      <w:r>
+        <w:t xml:space="preserve">Avisa si </w:t>
+      </w:r>
+      <w:r>
+        <w:rPr>
+          <w:b/>
+          <w:bCs/>
+        </w:rPr>
+        <w:t xml:space="preserve">quedó en la cortical cercana</w:t>
+      </w:r>
+      <w:r>
+        <w:t xml:space="preserve"> (sujeta poco) o si </w:t>
+      </w:r>
+      <w:r>
+        <w:rPr>
+          <w:b/>
+          <w:bCs/>
+        </w:rPr>
+        <w:t xml:space="preserve">se pasó más de 3 mm de la cortical opuesta</w:t>
+      </w:r>
+      <w:r>
+        <w:t xml:space="preserve"> (riesgo para vasos y nervios). Las cifras son una propuesta que el traumatólogo debe revisar.</w:t>
+      </w:r>
+    </w:p>
+    <w:p>
+      <w:pPr>
+        <w:pStyle w:val="ListParagraph"/>
+        <w:numPr>
+          <w:ilvl w:val="0"/>
+          <w:numId w:val="4"/>
+        </w:numPr>
+        <w:spacing w:after="90" w:line="280"/>
+      </w:pPr>
+      <w:r>
+        <w:t xml:space="preserve">Caben hasta 6 a la vez. </w:t>
+      </w:r>
+      <w:r>
+        <w:rPr>
+          <w:b/>
+          <w:bCs/>
+        </w:rPr>
+        <w:t xml:space="preserve">«Quitar las agujas»</w:t>
+      </w:r>
+      <w:r>
+        <w:t xml:space="preserve"> las retira todas, igual que «Reiniciar el caso».</w:t>
+      </w:r>
+    </w:p>
+    <w:p>
+      <w:pPr>
+        <w:pStyle w:val="Heading2"/>
+      </w:pPr>
+      <w:r>
+        <w:t xml:space="preserve">13.15 Lo que conviene saber al editar</w:t>
       </w:r>
     </w:p>
     <w:p>

</xml_diff>

<commit_message>
feat(simulador): el enclavado por pasos: entrada, guía de punta de oliva, dedo reductor, fresado y cambio de guía (D-210, P-005 E4)
Cada herramienta del grupo hace su paso con reglas puras y probadas: la guía se
atasca en el foco si los fragmentos están desalineados, el fresado sube de 0,5
en 0,5 mm hasta el calibre del clavo más el margen. Al volver a montarse el
lienzo la consola olvida lo que recordaba de la escena. El clavo es E5.

Co-Authored-By: Claude Sonnet 5.5 <noreply@anthropic.com>
</commit_message>
<xml_diff>
--- a/docs/MANUAL-DEL-SIMULADOR-QUIRURGICO.docx
+++ b/docs/MANUAL-DEL-SIMULADOR-QUIRURGICO.docx
@@ -22088,7 +22088,186 @@
         <w:pStyle w:val="Heading2"/>
       </w:pPr>
       <w:r>
-        <w:t xml:space="preserve">13.15 Lo que conviene saber al editar</w:t>
+        <w:t xml:space="preserve">13.15 El enclavado endomedular, paso a paso</w:t>
+      </w:r>
+    </w:p>
+    <w:p>
+      <w:pPr>
+        <w:spacing w:after="120" w:line="288"/>
+      </w:pPr>
+      <w:r>
+        <w:t xml:space="preserve">Las herramientas del grupo </w:t>
+      </w:r>
+      <w:r>
+        <w:rPr>
+          <w:b/>
+          <w:bCs/>
+        </w:rPr>
+        <w:t xml:space="preserve">Enclavado endomedular</w:t>
+      </w:r>
+      <w:r>
+        <w:t xml:space="preserve"> (punzón iniciador, guía de punta de oliva, dedo reductor, fresa canulada y tubo de intercambio) llevan el modo </w:t>
+      </w:r>
+      <w:r>
+        <w:rPr>
+          <w:b/>
+          <w:bCs/>
+        </w:rPr>
+        <w:t xml:space="preserve">«Enclavar»</w:t>
+      </w:r>
+      <w:r>
+        <w:t xml:space="preserve"> y se usan </w:t>
+      </w:r>
+      <w:r>
+        <w:rPr>
+          <w:b/>
+          <w:bCs/>
+        </w:rPr>
+        <w:t xml:space="preserve">en orden</w:t>
+      </w:r>
+      <w:r>
+        <w:t xml:space="preserve">.</w:t>
+      </w:r>
+    </w:p>
+    <w:p>
+      <w:pPr>
+        <w:pStyle w:val="ListParagraph"/>
+        <w:numPr>
+          <w:ilvl w:val="0"/>
+          <w:numId w:val="4"/>
+        </w:numPr>
+        <w:spacing w:after="90" w:line="280"/>
+      </w:pPr>
+      <w:r>
+        <w:rPr>
+          <w:b/>
+          <w:bCs/>
+        </w:rPr>
+        <w:t xml:space="preserve">Entrada</w:t>
+      </w:r>
+      <w:r>
+        <w:t xml:space="preserve">: con el punzón, un clic sobre el extremo proximal del hueso, por delante. Aro verde si sirve (hasta unos 25 mm del extremo y en línea con el canal); naranja si no: se corrige con otro clic.</w:t>
+      </w:r>
+    </w:p>
+    <w:p>
+      <w:pPr>
+        <w:pStyle w:val="ListParagraph"/>
+        <w:numPr>
+          <w:ilvl w:val="0"/>
+          <w:numId w:val="4"/>
+        </w:numPr>
+        <w:spacing w:after="90" w:line="280"/>
+      </w:pPr>
+      <w:r>
+        <w:rPr>
+          <w:b/>
+          <w:bCs/>
+        </w:rPr>
+        <w:t xml:space="preserve">Guía</w:t>
+      </w:r>
+      <w:r>
+        <w:t xml:space="preserve">: </w:t>
+      </w:r>
+      <w:r>
+        <w:rPr>
+          <w:b/>
+          <w:bCs/>
+        </w:rPr>
+        <w:t xml:space="preserve">mantenga pulsado</w:t>
+      </w:r>
+      <w:r>
+        <w:t xml:space="preserve"> en el lienzo para empujarla por el canal hasta unos 10 mm del extremo distal. Si los fragmentos están desalineados se </w:t>
+      </w:r>
+      <w:r>
+        <w:rPr>
+          <w:b/>
+          <w:bCs/>
+        </w:rPr>
+        <w:t xml:space="preserve">atasca en el foco</w:t>
+      </w:r>
+      <w:r>
+        <w:t xml:space="preserve">: reduzca mejor o ayúdese con el </w:t>
+      </w:r>
+      <w:r>
+        <w:rPr>
+          <w:b/>
+          <w:bCs/>
+        </w:rPr>
+        <w:t xml:space="preserve">dedo reductor</w:t>
+      </w:r>
+      <w:r>
+        <w:t xml:space="preserve"> (un clic lo pone o lo quita).</w:t>
+      </w:r>
+    </w:p>
+    <w:p>
+      <w:pPr>
+        <w:pStyle w:val="ListParagraph"/>
+        <w:numPr>
+          <w:ilvl w:val="0"/>
+          <w:numId w:val="4"/>
+        </w:numPr>
+        <w:spacing w:after="90" w:line="280"/>
+      </w:pPr>
+      <w:r>
+        <w:rPr>
+          <w:b/>
+          <w:bCs/>
+        </w:rPr>
+        <w:t xml:space="preserve">Fresado</w:t>
+      </w:r>
+      <w:r>
+        <w:t xml:space="preserve">: con la guía en el extremo distal, mantenga pulsado para pasar la cabeza elegida en el recuadro y suba </w:t>
+      </w:r>
+      <w:r>
+        <w:rPr>
+          <w:b/>
+          <w:bCs/>
+        </w:rPr>
+        <w:t xml:space="preserve">de 0,5 en 0,5 mm</w:t>
+      </w:r>
+      <w:r>
+        <w:t xml:space="preserve"> hasta 1 a 1,5 mm sobre el calibre del clavo de la bandeja. Un salto de más de 1 mm o fresar de más avisa.</w:t>
+      </w:r>
+    </w:p>
+    <w:p>
+      <w:pPr>
+        <w:pStyle w:val="ListParagraph"/>
+        <w:numPr>
+          <w:ilvl w:val="0"/>
+          <w:numId w:val="4"/>
+        </w:numPr>
+        <w:spacing w:after="90" w:line="280"/>
+      </w:pPr>
+      <w:r>
+        <w:rPr>
+          <w:b/>
+          <w:bCs/>
+        </w:rPr>
+        <w:t xml:space="preserve">Cambio de guía</w:t>
+      </w:r>
+      <w:r>
+        <w:t xml:space="preserve">: con el tubo de intercambio, un clic cambia la de punta de oliva por la lisa. El recuadro lista cada paso y dice qué falta antes del clavo; «Retirar la guía» y «Quitar el enclavado» deshacen.</w:t>
+      </w:r>
+    </w:p>
+    <w:p>
+      <w:pPr>
+        <w:pStyle w:val="ListParagraph"/>
+        <w:numPr>
+          <w:ilvl w:val="0"/>
+          <w:numId w:val="4"/>
+        </w:numPr>
+        <w:spacing w:after="90" w:line="280"/>
+      </w:pPr>
+      <w:r>
+        <w:t xml:space="preserve">La guía se ve en la fluoroscopia; el canal fresado se ve como un tubo ámbar a través del hueso, solo en la escena. Las cifras son una propuesta, pensada para la tibia, que el traumatólogo debe revisar. El clavo y su inserción son la etapa siguiente.</w:t>
+      </w:r>
+    </w:p>
+    <w:p>
+      <w:pPr>
+        <w:pStyle w:val="Heading2"/>
+      </w:pPr>
+      <w:r>
+        <w:t xml:space="preserve">13.16 Lo que conviene saber al editar</w:t>
       </w:r>
     </w:p>
     <w:p>

</xml_diff>

<commit_message>
feat(simulador): el clavo endomedular se introduce y se asienta con el arco, el impactador y el martillo (D-211, P-005 E5)
El clavo entra 40 mm a mano y cada golpe lo avanza según la holgura del canal
fresado; se juzga su calibre, su largo y su asiento (a ras, hundido, pasó la
articulación). El impactador exige el arco montado y el martillo directo avisa
de que deforma la rosca.

Co-Authored-By: Claude Sonnet 5.5 <noreply@anthropic.com>
</commit_message>
<xml_diff>
--- a/docs/MANUAL-DEL-SIMULADOR-QUIRURGICO.docx
+++ b/docs/MANUAL-DEL-SIMULADOR-QUIRURGICO.docx
@@ -22267,7 +22267,179 @@
         <w:pStyle w:val="Heading2"/>
       </w:pPr>
       <w:r>
-        <w:t xml:space="preserve">13.16 Lo que conviene saber al editar</w:t>
+        <w:t xml:space="preserve">13.16 Introducir y asentar el clavo</w:t>
+      </w:r>
+    </w:p>
+    <w:p>
+      <w:pPr>
+        <w:spacing w:after="120" w:line="288"/>
+      </w:pPr>
+      <w:r>
+        <w:t xml:space="preserve">Con el canal fresado y la guía lisa puesta, el </w:t>
+      </w:r>
+      <w:r>
+        <w:rPr>
+          <w:b/>
+          <w:bCs/>
+        </w:rPr>
+        <w:t xml:space="preserve">clavo</w:t>
+      </w:r>
+      <w:r>
+        <w:t xml:space="preserve"> de la bandeja (por ejemplo «Clavo tibial 9 × 330 mm») se coge y </w:t>
+      </w:r>
+      <w:r>
+        <w:rPr>
+          <w:b/>
+          <w:bCs/>
+        </w:rPr>
+        <w:t xml:space="preserve">un clic lo introduce unos 40 mm con la mano</w:t>
+      </w:r>
+      <w:r>
+        <w:t xml:space="preserve">. Se asienta con el arco, el impactador y el martillo.</w:t>
+      </w:r>
+    </w:p>
+    <w:p>
+      <w:pPr>
+        <w:pStyle w:val="ListParagraph"/>
+        <w:numPr>
+          <w:ilvl w:val="0"/>
+          <w:numId w:val="4"/>
+        </w:numPr>
+        <w:spacing w:after="90" w:line="280"/>
+      </w:pPr>
+      <w:r>
+        <w:rPr>
+          <w:b/>
+          <w:bCs/>
+        </w:rPr>
+        <w:t xml:space="preserve">Arco de inserción</w:t>
+      </w:r>
+      <w:r>
+        <w:t xml:space="preserve">: un clic lo monta en el clavo (otro lo retira). Hace falta para golpear con el impactador.</w:t>
+      </w:r>
+    </w:p>
+    <w:p>
+      <w:pPr>
+        <w:pStyle w:val="ListParagraph"/>
+        <w:numPr>
+          <w:ilvl w:val="0"/>
+          <w:numId w:val="4"/>
+        </w:numPr>
+        <w:spacing w:after="90" w:line="280"/>
+      </w:pPr>
+      <w:r>
+        <w:rPr>
+          <w:b/>
+          <w:bCs/>
+        </w:rPr>
+        <w:t xml:space="preserve">Impactador</w:t>
+      </w:r>
+      <w:r>
+        <w:t xml:space="preserve">: va conectado al arco y </w:t>
+      </w:r>
+      <w:r>
+        <w:rPr>
+          <w:b/>
+          <w:bCs/>
+        </w:rPr>
+        <w:t xml:space="preserve">cada clic es un golpe</w:t>
+      </w:r>
+      <w:r>
+        <w:t xml:space="preserve">: avanza 8 mm si el canal tiene 1 mm o más de holgura sobre el clavo, 3 mm si es justa y nada si no cabe (entonces hay que fresar más).</w:t>
+      </w:r>
+    </w:p>
+    <w:p>
+      <w:pPr>
+        <w:pStyle w:val="ListParagraph"/>
+        <w:numPr>
+          <w:ilvl w:val="0"/>
+          <w:numId w:val="4"/>
+        </w:numPr>
+        <w:spacing w:after="90" w:line="280"/>
+      </w:pPr>
+      <w:r>
+        <w:rPr>
+          <w:b/>
+          <w:bCs/>
+        </w:rPr>
+        <w:t xml:space="preserve">Martillo</w:t>
+      </w:r>
+      <w:r>
+        <w:t xml:space="preserve">: también avanza el clavo, pero golpea su extremo sin protección y avisa de que deforma la rosca donde va el arco.</w:t>
+      </w:r>
+    </w:p>
+    <w:p>
+      <w:pPr>
+        <w:pStyle w:val="ListParagraph"/>
+        <w:numPr>
+          <w:ilvl w:val="0"/>
+          <w:numId w:val="4"/>
+        </w:numPr>
+        <w:spacing w:after="90" w:line="280"/>
+      </w:pPr>
+      <w:r>
+        <w:t xml:space="preserve">El recuadro dice si el clavo asoma, queda </w:t>
+      </w:r>
+      <w:r>
+        <w:rPr>
+          <w:b/>
+          <w:bCs/>
+        </w:rPr>
+        <w:t xml:space="preserve">a ras (ideal)</w:t>
+      </w:r>
+      <w:r>
+        <w:t xml:space="preserve">, queda </w:t>
+      </w:r>
+      <w:r>
+        <w:rPr>
+          <w:b/>
+          <w:bCs/>
+        </w:rPr>
+        <w:t xml:space="preserve">hundido</w:t>
+      </w:r>
+      <w:r>
+        <w:t xml:space="preserve"> (más de 10 mm cuesta retirarlo) o </w:t>
+      </w:r>
+      <w:r>
+        <w:rPr>
+          <w:b/>
+          <w:bCs/>
+        </w:rPr>
+        <w:t xml:space="preserve">pasó la articulación</w:t>
+      </w:r>
+      <w:r>
+        <w:t xml:space="preserve">, y juzga su </w:t>
+      </w:r>
+      <w:r>
+        <w:rPr>
+          <w:b/>
+          <w:bCs/>
+        </w:rPr>
+        <w:t xml:space="preserve">largo</w:t>
+      </w:r>
+      <w:r>
+        <w:t xml:space="preserve"> contra el canal (deben sobrar de 10 a 40 mm). «Retirar el clavo» lo saca. El clavo se ve en la fluoroscopia.</w:t>
+      </w:r>
+    </w:p>
+    <w:p>
+      <w:pPr>
+        <w:pStyle w:val="ListParagraph"/>
+        <w:numPr>
+          <w:ilvl w:val="0"/>
+          <w:numId w:val="4"/>
+        </w:numPr>
+        <w:spacing w:after="90" w:line="280"/>
+      </w:pPr>
+      <w:r>
+        <w:t xml:space="preserve">Sin entrada buena, guía hasta el fondo, fresado suficiente para ese clavo y guía lisa, el clavo no entra y el aviso dice qué falta. Las cifras son una propuesta que el traumatólogo debe revisar. Los tornillos de bloqueo son la etapa siguiente.</w:t>
+      </w:r>
+    </w:p>
+    <w:p>
+      <w:pPr>
+        <w:pStyle w:val="Heading2"/>
+      </w:pPr>
+      <w:r>
+        <w:t xml:space="preserve">13.17 Lo que conviene saber al editar</w:t>
       </w:r>
     </w:p>
     <w:p>

</xml_diff>

<commit_message>
feat(simulador): el clavo se bloquea por sus orificios y los tornillos se aprietan con destornillador y limitador de torque (D-212, P-005 E6)
El tornillo de bloqueo pasa por el orificio del clavo más cercano al rayo del
cursor: guiado por el arco acierta siempre, a pulso se juzga la puntería. El
destornillador aprieta el tornillo al que se apunta (hexagonal o Stardrive de
la talla de la cabeza) y el limitador de torque se monta en él.

Co-Authored-By: Claude Sonnet 5.5 <noreply@anthropic.com>
</commit_message>
<xml_diff>
--- a/docs/MANUAL-DEL-SIMULADOR-QUIRURGICO.docx
+++ b/docs/MANUAL-DEL-SIMULADOR-QUIRURGICO.docx
@@ -22439,7 +22439,165 @@
         <w:pStyle w:val="Heading2"/>
       </w:pPr>
       <w:r>
-        <w:t xml:space="preserve">13.17 Lo que conviene saber al editar</w:t>
+        <w:t xml:space="preserve">13.17 Bloquear el clavo y apretar los tornillos</w:t>
+      </w:r>
+    </w:p>
+    <w:p>
+      <w:pPr>
+        <w:spacing w:after="120" w:line="288"/>
+      </w:pPr>
+      <w:r>
+        <w:t xml:space="preserve">Con el clavo asentado, el </w:t>
+      </w:r>
+      <w:r>
+        <w:rPr>
+          <w:b/>
+          <w:bCs/>
+        </w:rPr>
+        <w:t xml:space="preserve">tornillo de bloqueo de clavo</w:t>
+      </w:r>
+      <w:r>
+        <w:t xml:space="preserve"> se coge y </w:t>
+      </w:r>
+      <w:r>
+        <w:rPr>
+          <w:b/>
+          <w:bCs/>
+        </w:rPr>
+        <w:t xml:space="preserve">un clic en el hueso, a la altura de un orificio oscuro del clavo</w:t>
+      </w:r>
+      <w:r>
+        <w:t xml:space="preserve"> lo pone por ese orificio. El recuadro lista los orificios (P1… proximales, D1… distales).</w:t>
+      </w:r>
+    </w:p>
+    <w:p>
+      <w:pPr>
+        <w:pStyle w:val="ListParagraph"/>
+        <w:numPr>
+          <w:ilvl w:val="0"/>
+          <w:numId w:val="4"/>
+        </w:numPr>
+        <w:spacing w:after="90" w:line="280"/>
+      </w:pPr>
+      <w:r>
+        <w:t xml:space="preserve">Los </w:t>
+      </w:r>
+      <w:r>
+        <w:rPr>
+          <w:b/>
+          <w:bCs/>
+        </w:rPr>
+        <w:t xml:space="preserve">proximales, con el arco montado, van guiados</w:t>
+      </w:r>
+      <w:r>
+        <w:t xml:space="preserve"> y aciertan siempre. Los </w:t>
+      </w:r>
+      <w:r>
+        <w:rPr>
+          <w:b/>
+          <w:bCs/>
+        </w:rPr>
+        <w:t xml:space="preserve">distales van a pulso</w:t>
+      </w:r>
+      <w:r>
+        <w:t xml:space="preserve">: hasta 2 mm del centro acierta, hasta 4 mm roza el borde y más allá </w:t>
+      </w:r>
+      <w:r>
+        <w:rPr>
+          <w:b/>
+          <w:bCs/>
+        </w:rPr>
+        <w:t xml:space="preserve">pasa junto al clavo y no lo bloquea</w:t>
+      </w:r>
+      <w:r>
+        <w:t xml:space="preserve">.</w:t>
+      </w:r>
+    </w:p>
+    <w:p>
+      <w:pPr>
+        <w:pStyle w:val="ListParagraph"/>
+        <w:numPr>
+          <w:ilvl w:val="0"/>
+          <w:numId w:val="4"/>
+        </w:numPr>
+        <w:spacing w:after="90" w:line="280"/>
+      </w:pPr>
+      <w:r>
+        <w:t xml:space="preserve">El recuadro dice si el bloqueo es suficiente (uno arriba y dos abajo) o qué falta. Un clavo sin tornillos distales puede rotar y acortarse.</w:t>
+      </w:r>
+    </w:p>
+    <w:p>
+      <w:pPr>
+        <w:pStyle w:val="ListParagraph"/>
+        <w:numPr>
+          <w:ilvl w:val="0"/>
+          <w:numId w:val="4"/>
+        </w:numPr>
+        <w:spacing w:after="90" w:line="280"/>
+      </w:pPr>
+      <w:r>
+        <w:t xml:space="preserve">El </w:t>
+      </w:r>
+      <w:r>
+        <w:rPr>
+          <w:b/>
+          <w:bCs/>
+        </w:rPr>
+        <w:t xml:space="preserve">destornillador</w:t>
+      </w:r>
+      <w:r>
+        <w:t xml:space="preserve"> aprieta el tornillo al que se apunta con un clic: el </w:t>
+      </w:r>
+      <w:r>
+        <w:rPr>
+          <w:b/>
+          <w:bCs/>
+        </w:rPr>
+        <w:t xml:space="preserve">hexagonal</w:t>
+      </w:r>
+      <w:r>
+        <w:t xml:space="preserve"> para las cabezas normales y el </w:t>
+      </w:r>
+      <w:r>
+        <w:rPr>
+          <w:b/>
+          <w:bCs/>
+        </w:rPr>
+        <w:t xml:space="preserve">Stardrive</w:t>
+      </w:r>
+      <w:r>
+        <w:t xml:space="preserve"> de la talla de la cabeza para las bloqueadas (T15 en 3,5 mm, T25 en 5,0). Si no calza, lo dice.</w:t>
+      </w:r>
+    </w:p>
+    <w:p>
+      <w:pPr>
+        <w:pStyle w:val="ListParagraph"/>
+        <w:numPr>
+          <w:ilvl w:val="0"/>
+          <w:numId w:val="4"/>
+        </w:numPr>
+        <w:spacing w:after="90" w:line="280"/>
+      </w:pPr>
+      <w:r>
+        <w:t xml:space="preserve">El </w:t>
+      </w:r>
+      <w:r>
+        <w:rPr>
+          <w:b/>
+          <w:bCs/>
+        </w:rPr>
+        <w:t xml:space="preserve">limitador de torque</w:t>
+      </w:r>
+      <w:r>
+        <w:t xml:space="preserve"> se monta en el destornillador con un clic (otro lo quita): una cabeza bloqueada de placa sin limitador avisa del sobre-apriete, y uno de otros N·m avisa o salta antes. Las cifras son una propuesta que el traumatólogo debe revisar.</w:t>
+      </w:r>
+    </w:p>
+    <w:p>
+      <w:pPr>
+        <w:pStyle w:val="Heading2"/>
+      </w:pPr>
+      <w:r>
+        <w:t xml:space="preserve">13.18 Lo que conviene saber al editar</w:t>
       </w:r>
     </w:p>
     <w:p>

</xml_diff>

<commit_message>
feat(simulador): los injertos óseos se depositan en el defecto: esponjoso por puñados y bloque tricortical estructural (D-213, P-005 E7)
El esponjoso se acumula de 2 cc en 2 cc y se juzga contra el defecto de ahora
(la diástasis); el bloque debe medir el defecto con 2 mm de tolerancia y pide
fijación. El lienzo reporta lo puesto y la consola lo juzga, así que al reducir
el injerto que sobra se nota.

Co-Authored-By: Claude Sonnet 5.5 <noreply@anthropic.com>
</commit_message>
<xml_diff>
--- a/docs/MANUAL-DEL-SIMULADOR-QUIRURGICO.docx
+++ b/docs/MANUAL-DEL-SIMULADOR-QUIRURGICO.docx
@@ -22597,7 +22597,116 @@
         <w:pStyle w:val="Heading2"/>
       </w:pPr>
       <w:r>
-        <w:t xml:space="preserve">13.18 Lo que conviene saber al editar</w:t>
+        <w:t xml:space="preserve">13.18 Injertos óseos</w:t>
+      </w:r>
+    </w:p>
+    <w:p>
+      <w:pPr>
+        <w:spacing w:after="120" w:line="288"/>
+      </w:pPr>
+      <w:r>
+        <w:t xml:space="preserve">Los dos injertos del grupo </w:t>
+      </w:r>
+      <w:r>
+        <w:rPr>
+          <w:b/>
+          <w:bCs/>
+        </w:rPr>
+        <w:t xml:space="preserve">Injerto óseo</w:t>
+      </w:r>
+      <w:r>
+        <w:t xml:space="preserve"> se ponen con un clic junto al foco, donde falta hueso. El recuadro dice el </w:t>
+      </w:r>
+      <w:r>
+        <w:rPr>
+          <w:b/>
+          <w:bCs/>
+        </w:rPr>
+        <w:t xml:space="preserve">defecto</w:t>
+      </w:r>
+      <w:r>
+        <w:t xml:space="preserve"> que hay entre los fragmentos (la diástasis, con su volumen aproximado en cc).</w:t>
+      </w:r>
+    </w:p>
+    <w:p>
+      <w:pPr>
+        <w:pStyle w:val="ListParagraph"/>
+        <w:numPr>
+          <w:ilvl w:val="0"/>
+          <w:numId w:val="4"/>
+        </w:numPr>
+        <w:spacing w:after="90" w:line="280"/>
+      </w:pPr>
+      <w:r>
+        <w:rPr>
+          <w:b/>
+          <w:bCs/>
+        </w:rPr>
+        <w:t xml:space="preserve">Injerto esponjoso</w:t>
+      </w:r>
+      <w:r>
+        <w:t xml:space="preserve">: cada clic deposita un puñado de trozos (2 cc). Se busca llenar entre el 60 y el 120 % del defecto; con menos falta y con más se sale del foco sin compactarse.</w:t>
+      </w:r>
+    </w:p>
+    <w:p>
+      <w:pPr>
+        <w:pStyle w:val="ListParagraph"/>
+        <w:numPr>
+          <w:ilvl w:val="0"/>
+          <w:numId w:val="4"/>
+        </w:numPr>
+        <w:spacing w:after="90" w:line="280"/>
+      </w:pPr>
+      <w:r>
+        <w:rPr>
+          <w:b/>
+          <w:bCs/>
+        </w:rPr>
+        <w:t xml:space="preserve">Bloque tricortical de cresta ilíaca</w:t>
+      </w:r>
+      <w:r>
+        <w:t xml:space="preserve">: se pone en el hueco entre los fragmentos con el </w:t>
+      </w:r>
+      <w:r>
+        <w:rPr>
+          <w:b/>
+          <w:bCs/>
+        </w:rPr>
+        <w:t xml:space="preserve">largo</w:t>
+      </w:r>
+      <w:r>
+        <w:t xml:space="preserve"> que se elige en el recuadro; debe medir lo mismo que el defecto (2 mm de tolerancia). Como es estructural, el recuadro avisa mientras no haya placa, tornillos o clavo que lo sostengan.</w:t>
+      </w:r>
+    </w:p>
+    <w:p>
+      <w:pPr>
+        <w:pStyle w:val="ListParagraph"/>
+        <w:numPr>
+          <w:ilvl w:val="0"/>
+          <w:numId w:val="4"/>
+        </w:numPr>
+        <w:spacing w:after="90" w:line="280"/>
+      </w:pPr>
+      <w:r>
+        <w:t xml:space="preserve">Se juzgan contra el defecto </w:t>
+      </w:r>
+      <w:r>
+        <w:rPr>
+          <w:b/>
+          <w:bCs/>
+        </w:rPr>
+        <w:t xml:space="preserve">de ahora</w:t>
+      </w:r>
+      <w:r>
+        <w:t xml:space="preserve">: al reducir la fractura el defecto desaparece y el injerto puesto sobra. Los dos se ven en la fluoroscopia y «Quitar el injerto» los retira. Las cifras son una propuesta que el traumatólogo debe revisar.</w:t>
+      </w:r>
+    </w:p>
+    <w:p>
+      <w:pPr>
+        <w:pStyle w:val="Heading2"/>
+      </w:pPr>
+      <w:r>
+        <w:t xml:space="preserve">13.19 Lo que conviene saber al editar</w:t>
       </w:r>
     </w:p>
     <w:p>

</xml_diff>

<commit_message>
feat(simulador): todo lo colocado sobre el paciente sobrevive a recargar la página, y cada pérdida del contexto gráfico deja un diagnóstico (D-216)
Placa, tornillos, agujas, hoyos, periostio, enclavado entero, injertos, compresión
y la posición del fragmento y de los trozos movidos se guardan como
transformaciones y medidas, y al volver se reabren los modelos por su dirección. Cada
pérdida de contexto anota tarjeta, tamaño del dibujo, memoria y carga de la escena
con una causa probable, para dejar de adivinar por qué se cae.

Co-Authored-By: Claude Sonnet 5.5 <noreply@anthropic.com>
</commit_message>
<xml_diff>
--- a/docs/MANUAL-DEL-SIMULADOR-QUIRURGICO.docx
+++ b/docs/MANUAL-DEL-SIMULADOR-QUIRURGICO.docx
@@ -22706,7 +22706,102 @@
         <w:pStyle w:val="Heading2"/>
       </w:pPr>
       <w:r>
-        <w:t xml:space="preserve">13.19 Lo que conviene saber al editar</w:t>
+        <w:t xml:space="preserve">13.19 Si la imagen se va a blanco o se recarga la página</w:t>
+      </w:r>
+    </w:p>
+    <w:p>
+      <w:pPr>
+        <w:spacing w:after="120" w:line="288"/>
+      </w:pPr>
+      <w:r>
+        <w:t xml:space="preserve">El simulador </w:t>
+      </w:r>
+      <w:r>
+        <w:rPr>
+          <w:b/>
+          <w:bCs/>
+        </w:rPr>
+        <w:t xml:space="preserve">no pierde lo puesto en el paciente</w:t>
+      </w:r>
+      <w:r>
+        <w:t xml:space="preserve">. Si el navegador le quita la tarjeta gráfica, a los pocos segundos aparece «La imagen volvió» y todo sigue donde estaba: la placa, los tornillos, el clavo, los injertos, el periostio, las agujas y la reducción.</w:t>
+      </w:r>
+    </w:p>
+    <w:p>
+      <w:pPr>
+        <w:pStyle w:val="ListParagraph"/>
+        <w:numPr>
+          <w:ilvl w:val="0"/>
+          <w:numId w:val="4"/>
+        </w:numPr>
+        <w:spacing w:after="90" w:line="280"/>
+      </w:pPr>
+      <w:r>
+        <w:t xml:space="preserve">Si se </w:t>
+      </w:r>
+      <w:r>
+        <w:rPr>
+          <w:b/>
+          <w:bCs/>
+        </w:rPr>
+        <w:t xml:space="preserve">recarga la página</w:t>
+      </w:r>
+      <w:r>
+        <w:t xml:space="preserve"> (o la pestaña se cae y se vuelve a abrir en la misma ventana), lo puesto en el paciente </w:t>
+      </w:r>
+      <w:r>
+        <w:rPr>
+          <w:b/>
+          <w:bCs/>
+        </w:rPr>
+        <w:t xml:space="preserve">vuelve solo</w:t>
+      </w:r>
+      <w:r>
+        <w:t xml:space="preserve"> y el simulador avisa «Se recuperó lo que había puesto en el paciente».</w:t>
+      </w:r>
+    </w:p>
+    <w:p>
+      <w:pPr>
+        <w:pStyle w:val="ListParagraph"/>
+        <w:numPr>
+          <w:ilvl w:val="0"/>
+          <w:numId w:val="4"/>
+        </w:numPr>
+        <w:spacing w:after="90" w:line="280"/>
+      </w:pPr>
+      <w:r>
+        <w:t xml:space="preserve">Solo se vacía si el residente lo quita o pulsa «Reiniciar caso». Lo que </w:t>
+      </w:r>
+      <w:r>
+        <w:rPr>
+          <w:b/>
+          <w:bCs/>
+        </w:rPr>
+        <w:t xml:space="preserve">no</w:t>
+      </w:r>
+      <w:r>
+        <w:t xml:space="preserve"> vuelve es la placa que se estaba doblando en la mesa de modelado.</w:t>
+      </w:r>
+    </w:p>
+    <w:p>
+      <w:pPr>
+        <w:pStyle w:val="ListParagraph"/>
+        <w:numPr>
+          <w:ilvl w:val="0"/>
+          <w:numId w:val="4"/>
+        </w:numPr>
+        <w:spacing w:after="90" w:line="280"/>
+      </w:pPr>
+      <w:r>
+        <w:t xml:space="preserve">Cada vez que se pierde la tarjeta gráfica, el navegador deja constancia de lo que estaba pasando (tarjeta, tamaño del dibujo, memoria, carga de la escena) para saber por qué ocurrió.</w:t>
+      </w:r>
+    </w:p>
+    <w:p>
+      <w:pPr>
+        <w:pStyle w:val="Heading2"/>
+      </w:pPr>
+      <w:r>
+        <w:t xml:space="preserve">13.20 Lo que conviene saber al editar</w:t>
       </w:r>
     </w:p>
     <w:p>

</xml_diff>